<commit_message>
docs: align sprint1 API contracts with current routes
</commit_message>
<xml_diff>
--- a/docs/U4/design/task52-publish-guide-api-spec.docx
+++ b/docs/U4/design/task52-publish-guide-api-spec.docx
@@ -20,7 +20,7 @@
     </w:p>
     <w:p>
       <w:r>
-        <w:t>เอกสารนี้กำหนดสัญญา API สำหรับเผยแพร่แนวข้อสอบตาม U4 และ Task50 โดยอ้างอิง FastAPI, Pydantic และรูปแบบชั้น Router, Service, DAO ที่มีใน Backend ปัจจุบัน การบันทึกข้อมูลจริงเป็นงาน Task56 และ Task57</w:t>
+        <w:t>เอกสารนี้อธิบาย API เผยแพร่แนวข้อสอบที่ใช้งานแล้ว Router รับข้อมูลและตรวจ Login ส่วน PublishGuideService ตรวจรายวิชา กำหนดเจ้าของ และควบคุม transaction ผ่าน DAO</w:t>
       </w:r>
     </w:p>
     <w:p>
@@ -28,7 +28,7 @@
         <w:pStyle w:val="Heading1"/>
       </w:pPr>
       <w:r>
-        <w:t>API ที่เสนอ</w:t>
+        <w:t>API ที่ใช้งาน</w:t>
       </w:r>
     </w:p>
     <w:p>
@@ -36,7 +36,7 @@
         <w:pStyle w:val="Heading2"/>
       </w:pPr>
       <w:r>
-        <w:t>`POST /guides`</w:t>
+        <w:t>POST /guides</w:t>
       </w:r>
     </w:p>
     <w:p>
@@ -54,15 +54,13 @@
     </w:p>
     <w:p>
       <w:pPr>
+        <w:keepLines/>
         <w:spacing w:after="120"/>
-        <w:ind w:left="173"/>
-        <w:shd w:fill="F3F5F7"/>
       </w:pPr>
       <w:r>
         <w:rPr>
           <w:rFonts w:ascii="Consolas" w:hAnsi="Consolas"/>
-          <w:color w:val="2D3748"/>
-          <w:sz w:val="16"/>
+          <w:sz w:val="18"/>
         </w:rPr>
         <w:t>POST /guides</w:t>
         <w:br/>
@@ -73,15 +71,13 @@
     </w:p>
     <w:p>
       <w:pPr>
+        <w:keepLines/>
         <w:spacing w:after="120"/>
-        <w:ind w:left="173"/>
-        <w:shd w:fill="F3F5F7"/>
       </w:pPr>
       <w:r>
         <w:rPr>
           <w:rFonts w:ascii="Consolas" w:hAnsi="Consolas"/>
-          <w:color w:val="2D3748"/>
-          <w:sz w:val="16"/>
+          <w:sz w:val="18"/>
         </w:rPr>
         <w:t>{</w:t>
         <w:br/>
@@ -111,38 +107,44 @@
     <w:tbl>
       <w:tblPr>
         <w:tblW w:type="auto" w:w="0"/>
-        <w:jc w:val="center"/>
-        <w:tblLayout w:type="fixed"/>
+        <w:tblLayout w:type="autofit"/>
         <w:tblLook w:firstColumn="1" w:firstRow="1" w:lastColumn="0" w:lastRow="0" w:noHBand="0" w:noVBand="1" w:val="04A0"/>
       </w:tblPr>
       <w:tblGrid>
-        <w:gridCol w:w="3389"/>
-        <w:gridCol w:w="3389"/>
-        <w:gridCol w:w="3389"/>
+        <w:gridCol w:w="3346"/>
+        <w:gridCol w:w="3346"/>
+        <w:gridCol w:w="3346"/>
       </w:tblGrid>
       <w:tr>
+        <w:trPr>
+          <w:cantSplit/>
+          <w:tblHeader/>
+        </w:trPr>
         <w:tc>
           <w:tcPr>
-            <w:tcW w:type="dxa" w:w="1728"/>
-            <w:vAlign w:val="center"/>
-            <w:shd w:fill="1F4E78"/>
+            <w:tcW w:type="dxa" w:w="3346"/>
+            <w:tcBorders>
+              <w:top w:val="single" w:sz="4" w:color="D9D9D9"/>
+              <w:left w:val="single" w:sz="4" w:color="D9D9D9"/>
+              <w:bottom w:val="single" w:sz="4" w:color="D9D9D9"/>
+              <w:right w:val="single" w:sz="4" w:color="D9D9D9"/>
+            </w:tcBorders>
             <w:tcMar>
-              <w:top w:w="75" w:type="dxa"/>
-              <w:start w:w="90" w:type="dxa"/>
-              <w:bottom w:w="75" w:type="dxa"/>
-              <w:end w:w="90" w:type="dxa"/>
+              <w:top w:w="85" w:type="dxa"/>
+              <w:left w:w="85" w:type="dxa"/>
+              <w:bottom w:w="85" w:type="dxa"/>
+              <w:right w:w="85" w:type="dxa"/>
             </w:tcMar>
+            <w:shd w:fill="E8EEF4"/>
           </w:tcPr>
           <w:p>
             <w:pPr>
-              <w:spacing w:after="0"/>
+              <w:spacing w:after="60"/>
             </w:pPr>
             <w:r>
               <w:rPr>
-                <w:rFonts w:ascii="Tahoma" w:hAnsi="Tahoma" w:eastAsia="Tahoma"/>
                 <w:b/>
-                <w:color w:val="FFFFFF"/>
-                <w:sz w:val="16"/>
+                <w:sz w:val="18"/>
               </w:rPr>
               <w:t>ฟิลด์</w:t>
             </w:r>
@@ -150,26 +152,29 @@
         </w:tc>
         <w:tc>
           <w:tcPr>
-            <w:tcW w:type="dxa" w:w="1656"/>
-            <w:vAlign w:val="center"/>
-            <w:shd w:fill="1F4E78"/>
+            <w:tcW w:type="dxa" w:w="3346"/>
+            <w:tcBorders>
+              <w:top w:val="single" w:sz="4" w:color="D9D9D9"/>
+              <w:left w:val="single" w:sz="4" w:color="D9D9D9"/>
+              <w:bottom w:val="single" w:sz="4" w:color="D9D9D9"/>
+              <w:right w:val="single" w:sz="4" w:color="D9D9D9"/>
+            </w:tcBorders>
             <w:tcMar>
-              <w:top w:w="75" w:type="dxa"/>
-              <w:start w:w="90" w:type="dxa"/>
-              <w:bottom w:w="75" w:type="dxa"/>
-              <w:end w:w="90" w:type="dxa"/>
+              <w:top w:w="85" w:type="dxa"/>
+              <w:left w:w="85" w:type="dxa"/>
+              <w:bottom w:w="85" w:type="dxa"/>
+              <w:right w:w="85" w:type="dxa"/>
             </w:tcMar>
+            <w:shd w:fill="E8EEF4"/>
           </w:tcPr>
           <w:p>
             <w:pPr>
-              <w:spacing w:after="0"/>
+              <w:spacing w:after="60"/>
             </w:pPr>
             <w:r>
               <w:rPr>
-                <w:rFonts w:ascii="Tahoma" w:hAnsi="Tahoma" w:eastAsia="Tahoma"/>
                 <w:b/>
-                <w:color w:val="FFFFFF"/>
-                <w:sz w:val="16"/>
+                <w:sz w:val="18"/>
               </w:rPr>
               <w:t>ชนิด</w:t>
             </w:r>
@@ -177,26 +182,29 @@
         </w:tc>
         <w:tc>
           <w:tcPr>
-            <w:tcW w:type="dxa" w:w="6480"/>
-            <w:vAlign w:val="center"/>
-            <w:shd w:fill="1F4E78"/>
+            <w:tcW w:type="dxa" w:w="3346"/>
+            <w:tcBorders>
+              <w:top w:val="single" w:sz="4" w:color="D9D9D9"/>
+              <w:left w:val="single" w:sz="4" w:color="D9D9D9"/>
+              <w:bottom w:val="single" w:sz="4" w:color="D9D9D9"/>
+              <w:right w:val="single" w:sz="4" w:color="D9D9D9"/>
+            </w:tcBorders>
             <w:tcMar>
-              <w:top w:w="75" w:type="dxa"/>
-              <w:start w:w="90" w:type="dxa"/>
-              <w:bottom w:w="75" w:type="dxa"/>
-              <w:end w:w="90" w:type="dxa"/>
+              <w:top w:w="85" w:type="dxa"/>
+              <w:left w:w="85" w:type="dxa"/>
+              <w:bottom w:w="85" w:type="dxa"/>
+              <w:right w:w="85" w:type="dxa"/>
             </w:tcMar>
+            <w:shd w:fill="E8EEF4"/>
           </w:tcPr>
           <w:p>
             <w:pPr>
-              <w:spacing w:after="0"/>
+              <w:spacing w:after="60"/>
             </w:pPr>
             <w:r>
               <w:rPr>
-                <w:rFonts w:ascii="Tahoma" w:hAnsi="Tahoma" w:eastAsia="Tahoma"/>
                 <w:b/>
-                <w:color w:val="FFFFFF"/>
-                <w:sz w:val="16"/>
+                <w:sz w:val="18"/>
               </w:rPr>
               <w:t>กติกา</w:t>
             </w:r>
@@ -204,27 +212,33 @@
         </w:tc>
       </w:tr>
       <w:tr>
+        <w:trPr>
+          <w:cantSplit/>
+        </w:trPr>
         <w:tc>
           <w:tcPr>
-            <w:tcW w:type="dxa" w:w="1728"/>
-            <w:vAlign w:val="center"/>
-            <w:shd w:fill="FFFFFF"/>
+            <w:tcW w:type="dxa" w:w="3346"/>
+            <w:tcBorders>
+              <w:top w:val="single" w:sz="4" w:color="D9D9D9"/>
+              <w:left w:val="single" w:sz="4" w:color="D9D9D9"/>
+              <w:bottom w:val="single" w:sz="4" w:color="D9D9D9"/>
+              <w:right w:val="single" w:sz="4" w:color="D9D9D9"/>
+            </w:tcBorders>
             <w:tcMar>
-              <w:top w:w="75" w:type="dxa"/>
-              <w:start w:w="90" w:type="dxa"/>
-              <w:bottom w:w="75" w:type="dxa"/>
-              <w:end w:w="90" w:type="dxa"/>
+              <w:top w:w="85" w:type="dxa"/>
+              <w:left w:w="85" w:type="dxa"/>
+              <w:bottom w:w="85" w:type="dxa"/>
+              <w:right w:w="85" w:type="dxa"/>
             </w:tcMar>
           </w:tcPr>
           <w:p>
             <w:pPr>
-              <w:spacing w:after="0"/>
+              <w:spacing w:after="60"/>
             </w:pPr>
             <w:r>
               <w:rPr>
-                <w:rFonts w:ascii="Tahoma" w:hAnsi="Tahoma" w:eastAsia="Tahoma"/>
-                <w:color w:val="1F4E79"/>
-                <w:sz w:val="16"/>
+                <w:b w:val="0"/>
+                <w:sz w:val="18"/>
               </w:rPr>
               <w:t>course_id</w:t>
             </w:r>
@@ -232,24 +246,28 @@
         </w:tc>
         <w:tc>
           <w:tcPr>
-            <w:tcW w:type="dxa" w:w="1656"/>
-            <w:vAlign w:val="center"/>
-            <w:shd w:fill="FFFFFF"/>
+            <w:tcW w:type="dxa" w:w="3346"/>
+            <w:tcBorders>
+              <w:top w:val="single" w:sz="4" w:color="D9D9D9"/>
+              <w:left w:val="single" w:sz="4" w:color="D9D9D9"/>
+              <w:bottom w:val="single" w:sz="4" w:color="D9D9D9"/>
+              <w:right w:val="single" w:sz="4" w:color="D9D9D9"/>
+            </w:tcBorders>
             <w:tcMar>
-              <w:top w:w="75" w:type="dxa"/>
-              <w:start w:w="90" w:type="dxa"/>
-              <w:bottom w:w="75" w:type="dxa"/>
-              <w:end w:w="90" w:type="dxa"/>
+              <w:top w:w="85" w:type="dxa"/>
+              <w:left w:w="85" w:type="dxa"/>
+              <w:bottom w:w="85" w:type="dxa"/>
+              <w:right w:w="85" w:type="dxa"/>
             </w:tcMar>
           </w:tcPr>
           <w:p>
             <w:pPr>
-              <w:spacing w:after="0"/>
+              <w:spacing w:after="60"/>
             </w:pPr>
             <w:r>
               <w:rPr>
-                <w:rFonts w:ascii="Tahoma" w:hAnsi="Tahoma" w:eastAsia="Tahoma"/>
-                <w:sz w:val="16"/>
+                <w:b w:val="0"/>
+                <w:sz w:val="18"/>
               </w:rPr>
               <w:t>integer</w:t>
             </w:r>
@@ -257,24 +275,28 @@
         </w:tc>
         <w:tc>
           <w:tcPr>
-            <w:tcW w:type="dxa" w:w="6480"/>
-            <w:vAlign w:val="center"/>
-            <w:shd w:fill="FFFFFF"/>
+            <w:tcW w:type="dxa" w:w="3346"/>
+            <w:tcBorders>
+              <w:top w:val="single" w:sz="4" w:color="D9D9D9"/>
+              <w:left w:val="single" w:sz="4" w:color="D9D9D9"/>
+              <w:bottom w:val="single" w:sz="4" w:color="D9D9D9"/>
+              <w:right w:val="single" w:sz="4" w:color="D9D9D9"/>
+            </w:tcBorders>
             <w:tcMar>
-              <w:top w:w="75" w:type="dxa"/>
-              <w:start w:w="90" w:type="dxa"/>
-              <w:bottom w:w="75" w:type="dxa"/>
-              <w:end w:w="90" w:type="dxa"/>
+              <w:top w:w="85" w:type="dxa"/>
+              <w:left w:w="85" w:type="dxa"/>
+              <w:bottom w:w="85" w:type="dxa"/>
+              <w:right w:w="85" w:type="dxa"/>
             </w:tcMar>
           </w:tcPr>
           <w:p>
             <w:pPr>
-              <w:spacing w:after="0"/>
+              <w:spacing w:after="60"/>
             </w:pPr>
             <w:r>
               <w:rPr>
-                <w:rFonts w:ascii="Tahoma" w:hAnsi="Tahoma" w:eastAsia="Tahoma"/>
-                <w:sz w:val="16"/>
+                <w:b w:val="0"/>
+                <w:sz w:val="18"/>
               </w:rPr>
               <w:t>ต้องมากกว่า 0 และต้องตรงกับรายวิชาในระบบ</w:t>
             </w:r>
@@ -282,27 +304,33 @@
         </w:tc>
       </w:tr>
       <w:tr>
+        <w:trPr>
+          <w:cantSplit/>
+        </w:trPr>
         <w:tc>
           <w:tcPr>
-            <w:tcW w:type="dxa" w:w="1728"/>
-            <w:vAlign w:val="center"/>
-            <w:shd w:fill="F3F6FA"/>
+            <w:tcW w:type="dxa" w:w="3346"/>
+            <w:tcBorders>
+              <w:top w:val="single" w:sz="4" w:color="D9D9D9"/>
+              <w:left w:val="single" w:sz="4" w:color="D9D9D9"/>
+              <w:bottom w:val="single" w:sz="4" w:color="D9D9D9"/>
+              <w:right w:val="single" w:sz="4" w:color="D9D9D9"/>
+            </w:tcBorders>
             <w:tcMar>
-              <w:top w:w="75" w:type="dxa"/>
-              <w:start w:w="90" w:type="dxa"/>
-              <w:bottom w:w="75" w:type="dxa"/>
-              <w:end w:w="90" w:type="dxa"/>
+              <w:top w:w="85" w:type="dxa"/>
+              <w:left w:w="85" w:type="dxa"/>
+              <w:bottom w:w="85" w:type="dxa"/>
+              <w:right w:w="85" w:type="dxa"/>
             </w:tcMar>
           </w:tcPr>
           <w:p>
             <w:pPr>
-              <w:spacing w:after="0"/>
+              <w:spacing w:after="60"/>
             </w:pPr>
             <w:r>
               <w:rPr>
-                <w:rFonts w:ascii="Tahoma" w:hAnsi="Tahoma" w:eastAsia="Tahoma"/>
-                <w:color w:val="1F4E79"/>
-                <w:sz w:val="16"/>
+                <w:b w:val="0"/>
+                <w:sz w:val="18"/>
               </w:rPr>
               <w:t>title</w:t>
             </w:r>
@@ -310,24 +338,28 @@
         </w:tc>
         <w:tc>
           <w:tcPr>
-            <w:tcW w:type="dxa" w:w="1656"/>
-            <w:vAlign w:val="center"/>
-            <w:shd w:fill="F3F6FA"/>
+            <w:tcW w:type="dxa" w:w="3346"/>
+            <w:tcBorders>
+              <w:top w:val="single" w:sz="4" w:color="D9D9D9"/>
+              <w:left w:val="single" w:sz="4" w:color="D9D9D9"/>
+              <w:bottom w:val="single" w:sz="4" w:color="D9D9D9"/>
+              <w:right w:val="single" w:sz="4" w:color="D9D9D9"/>
+            </w:tcBorders>
             <w:tcMar>
-              <w:top w:w="75" w:type="dxa"/>
-              <w:start w:w="90" w:type="dxa"/>
-              <w:bottom w:w="75" w:type="dxa"/>
-              <w:end w:w="90" w:type="dxa"/>
+              <w:top w:w="85" w:type="dxa"/>
+              <w:left w:w="85" w:type="dxa"/>
+              <w:bottom w:w="85" w:type="dxa"/>
+              <w:right w:w="85" w:type="dxa"/>
             </w:tcMar>
           </w:tcPr>
           <w:p>
             <w:pPr>
-              <w:spacing w:after="0"/>
+              <w:spacing w:after="60"/>
             </w:pPr>
             <w:r>
               <w:rPr>
-                <w:rFonts w:ascii="Tahoma" w:hAnsi="Tahoma" w:eastAsia="Tahoma"/>
-                <w:sz w:val="16"/>
+                <w:b w:val="0"/>
+                <w:sz w:val="18"/>
               </w:rPr>
               <w:t>string</w:t>
             </w:r>
@@ -335,24 +367,28 @@
         </w:tc>
         <w:tc>
           <w:tcPr>
-            <w:tcW w:type="dxa" w:w="6480"/>
-            <w:vAlign w:val="center"/>
-            <w:shd w:fill="F3F6FA"/>
+            <w:tcW w:type="dxa" w:w="3346"/>
+            <w:tcBorders>
+              <w:top w:val="single" w:sz="4" w:color="D9D9D9"/>
+              <w:left w:val="single" w:sz="4" w:color="D9D9D9"/>
+              <w:bottom w:val="single" w:sz="4" w:color="D9D9D9"/>
+              <w:right w:val="single" w:sz="4" w:color="D9D9D9"/>
+            </w:tcBorders>
             <w:tcMar>
-              <w:top w:w="75" w:type="dxa"/>
-              <w:start w:w="90" w:type="dxa"/>
-              <w:bottom w:w="75" w:type="dxa"/>
-              <w:end w:w="90" w:type="dxa"/>
+              <w:top w:w="85" w:type="dxa"/>
+              <w:left w:w="85" w:type="dxa"/>
+              <w:bottom w:w="85" w:type="dxa"/>
+              <w:right w:w="85" w:type="dxa"/>
             </w:tcMar>
           </w:tcPr>
           <w:p>
             <w:pPr>
-              <w:spacing w:after="0"/>
+              <w:spacing w:after="60"/>
             </w:pPr>
             <w:r>
               <w:rPr>
-                <w:rFonts w:ascii="Tahoma" w:hAnsi="Tahoma" w:eastAsia="Tahoma"/>
-                <w:sz w:val="16"/>
+                <w:b w:val="0"/>
+                <w:sz w:val="18"/>
               </w:rPr>
               <w:t>บังคับ ห้ามเป็นค่าว่างหรือมีแต่ช่องว่าง ความยาวไม่เกิน 200 ตัวอักษรตาม Entity</w:t>
             </w:r>
@@ -360,27 +396,33 @@
         </w:tc>
       </w:tr>
       <w:tr>
+        <w:trPr>
+          <w:cantSplit/>
+        </w:trPr>
         <w:tc>
           <w:tcPr>
-            <w:tcW w:type="dxa" w:w="1728"/>
-            <w:vAlign w:val="center"/>
-            <w:shd w:fill="FFFFFF"/>
+            <w:tcW w:type="dxa" w:w="3346"/>
+            <w:tcBorders>
+              <w:top w:val="single" w:sz="4" w:color="D9D9D9"/>
+              <w:left w:val="single" w:sz="4" w:color="D9D9D9"/>
+              <w:bottom w:val="single" w:sz="4" w:color="D9D9D9"/>
+              <w:right w:val="single" w:sz="4" w:color="D9D9D9"/>
+            </w:tcBorders>
             <w:tcMar>
-              <w:top w:w="75" w:type="dxa"/>
-              <w:start w:w="90" w:type="dxa"/>
-              <w:bottom w:w="75" w:type="dxa"/>
-              <w:end w:w="90" w:type="dxa"/>
+              <w:top w:w="85" w:type="dxa"/>
+              <w:left w:w="85" w:type="dxa"/>
+              <w:bottom w:w="85" w:type="dxa"/>
+              <w:right w:w="85" w:type="dxa"/>
             </w:tcMar>
           </w:tcPr>
           <w:p>
             <w:pPr>
-              <w:spacing w:after="0"/>
+              <w:spacing w:after="60"/>
             </w:pPr>
             <w:r>
               <w:rPr>
-                <w:rFonts w:ascii="Tahoma" w:hAnsi="Tahoma" w:eastAsia="Tahoma"/>
-                <w:color w:val="1F4E79"/>
-                <w:sz w:val="16"/>
+                <w:b w:val="0"/>
+                <w:sz w:val="18"/>
               </w:rPr>
               <w:t>academic_year</w:t>
             </w:r>
@@ -388,24 +430,28 @@
         </w:tc>
         <w:tc>
           <w:tcPr>
-            <w:tcW w:type="dxa" w:w="1656"/>
-            <w:vAlign w:val="center"/>
-            <w:shd w:fill="FFFFFF"/>
+            <w:tcW w:type="dxa" w:w="3346"/>
+            <w:tcBorders>
+              <w:top w:val="single" w:sz="4" w:color="D9D9D9"/>
+              <w:left w:val="single" w:sz="4" w:color="D9D9D9"/>
+              <w:bottom w:val="single" w:sz="4" w:color="D9D9D9"/>
+              <w:right w:val="single" w:sz="4" w:color="D9D9D9"/>
+            </w:tcBorders>
             <w:tcMar>
-              <w:top w:w="75" w:type="dxa"/>
-              <w:start w:w="90" w:type="dxa"/>
-              <w:bottom w:w="75" w:type="dxa"/>
-              <w:end w:w="90" w:type="dxa"/>
+              <w:top w:w="85" w:type="dxa"/>
+              <w:left w:w="85" w:type="dxa"/>
+              <w:bottom w:w="85" w:type="dxa"/>
+              <w:right w:w="85" w:type="dxa"/>
             </w:tcMar>
           </w:tcPr>
           <w:p>
             <w:pPr>
-              <w:spacing w:after="0"/>
+              <w:spacing w:after="60"/>
             </w:pPr>
             <w:r>
               <w:rPr>
-                <w:rFonts w:ascii="Tahoma" w:hAnsi="Tahoma" w:eastAsia="Tahoma"/>
-                <w:sz w:val="16"/>
+                <w:b w:val="0"/>
+                <w:sz w:val="18"/>
               </w:rPr>
               <w:t>integer</w:t>
             </w:r>
@@ -413,52 +459,62 @@
         </w:tc>
         <w:tc>
           <w:tcPr>
-            <w:tcW w:type="dxa" w:w="6480"/>
-            <w:vAlign w:val="center"/>
-            <w:shd w:fill="FFFFFF"/>
+            <w:tcW w:type="dxa" w:w="3346"/>
+            <w:tcBorders>
+              <w:top w:val="single" w:sz="4" w:color="D9D9D9"/>
+              <w:left w:val="single" w:sz="4" w:color="D9D9D9"/>
+              <w:bottom w:val="single" w:sz="4" w:color="D9D9D9"/>
+              <w:right w:val="single" w:sz="4" w:color="D9D9D9"/>
+            </w:tcBorders>
             <w:tcMar>
-              <w:top w:w="75" w:type="dxa"/>
-              <w:start w:w="90" w:type="dxa"/>
-              <w:bottom w:w="75" w:type="dxa"/>
-              <w:end w:w="90" w:type="dxa"/>
+              <w:top w:w="85" w:type="dxa"/>
+              <w:left w:w="85" w:type="dxa"/>
+              <w:bottom w:w="85" w:type="dxa"/>
+              <w:right w:w="85" w:type="dxa"/>
             </w:tcMar>
           </w:tcPr>
           <w:p>
             <w:pPr>
-              <w:spacing w:after="0"/>
+              <w:spacing w:after="60"/>
             </w:pPr>
             <w:r>
               <w:rPr>
-                <w:rFonts w:ascii="Tahoma" w:hAnsi="Tahoma" w:eastAsia="Tahoma"/>
-                <w:sz w:val="16"/>
+                <w:b w:val="0"/>
+                <w:sz w:val="18"/>
               </w:rPr>
-              <w:t>บังคับ เป็นปี พ.ศ. และต้องอยู่ในชุดปีที่ระบบอนุญาต ซึ่งต้องกำหนดแหล่งข้อมูลร่วมกันก่อนทำ Task57</w:t>
+              <w:t>บังคับ เป็นหนึ่งใน 2566, 2567, 2568, 2569 ตาม AcademicYear ใน schema</w:t>
             </w:r>
           </w:p>
         </w:tc>
       </w:tr>
       <w:tr>
+        <w:trPr>
+          <w:cantSplit/>
+        </w:trPr>
         <w:tc>
           <w:tcPr>
-            <w:tcW w:type="dxa" w:w="1728"/>
-            <w:vAlign w:val="center"/>
-            <w:shd w:fill="F3F6FA"/>
+            <w:tcW w:type="dxa" w:w="3346"/>
+            <w:tcBorders>
+              <w:top w:val="single" w:sz="4" w:color="D9D9D9"/>
+              <w:left w:val="single" w:sz="4" w:color="D9D9D9"/>
+              <w:bottom w:val="single" w:sz="4" w:color="D9D9D9"/>
+              <w:right w:val="single" w:sz="4" w:color="D9D9D9"/>
+            </w:tcBorders>
             <w:tcMar>
-              <w:top w:w="75" w:type="dxa"/>
-              <w:start w:w="90" w:type="dxa"/>
-              <w:bottom w:w="75" w:type="dxa"/>
-              <w:end w:w="90" w:type="dxa"/>
+              <w:top w:w="85" w:type="dxa"/>
+              <w:left w:w="85" w:type="dxa"/>
+              <w:bottom w:w="85" w:type="dxa"/>
+              <w:right w:w="85" w:type="dxa"/>
             </w:tcMar>
           </w:tcPr>
           <w:p>
             <w:pPr>
-              <w:spacing w:after="0"/>
+              <w:spacing w:after="60"/>
             </w:pPr>
             <w:r>
               <w:rPr>
-                <w:rFonts w:ascii="Tahoma" w:hAnsi="Tahoma" w:eastAsia="Tahoma"/>
-                <w:color w:val="1F4E79"/>
-                <w:sz w:val="16"/>
+                <w:b w:val="0"/>
+                <w:sz w:val="18"/>
               </w:rPr>
               <w:t>semester</w:t>
             </w:r>
@@ -466,24 +522,28 @@
         </w:tc>
         <w:tc>
           <w:tcPr>
-            <w:tcW w:type="dxa" w:w="1656"/>
-            <w:vAlign w:val="center"/>
-            <w:shd w:fill="F3F6FA"/>
+            <w:tcW w:type="dxa" w:w="3346"/>
+            <w:tcBorders>
+              <w:top w:val="single" w:sz="4" w:color="D9D9D9"/>
+              <w:left w:val="single" w:sz="4" w:color="D9D9D9"/>
+              <w:bottom w:val="single" w:sz="4" w:color="D9D9D9"/>
+              <w:right w:val="single" w:sz="4" w:color="D9D9D9"/>
+            </w:tcBorders>
             <w:tcMar>
-              <w:top w:w="75" w:type="dxa"/>
-              <w:start w:w="90" w:type="dxa"/>
-              <w:bottom w:w="75" w:type="dxa"/>
-              <w:end w:w="90" w:type="dxa"/>
+              <w:top w:w="85" w:type="dxa"/>
+              <w:left w:w="85" w:type="dxa"/>
+              <w:bottom w:w="85" w:type="dxa"/>
+              <w:right w:w="85" w:type="dxa"/>
             </w:tcMar>
           </w:tcPr>
           <w:p>
             <w:pPr>
-              <w:spacing w:after="0"/>
+              <w:spacing w:after="60"/>
             </w:pPr>
             <w:r>
               <w:rPr>
-                <w:rFonts w:ascii="Tahoma" w:hAnsi="Tahoma" w:eastAsia="Tahoma"/>
-                <w:sz w:val="16"/>
+                <w:b w:val="0"/>
+                <w:sz w:val="18"/>
               </w:rPr>
               <w:t>integer</w:t>
             </w:r>
@@ -491,112 +551,62 @@
         </w:tc>
         <w:tc>
           <w:tcPr>
-            <w:tcW w:type="dxa" w:w="6480"/>
-            <w:vAlign w:val="center"/>
-            <w:shd w:fill="F3F6FA"/>
+            <w:tcW w:type="dxa" w:w="3346"/>
+            <w:tcBorders>
+              <w:top w:val="single" w:sz="4" w:color="D9D9D9"/>
+              <w:left w:val="single" w:sz="4" w:color="D9D9D9"/>
+              <w:bottom w:val="single" w:sz="4" w:color="D9D9D9"/>
+              <w:right w:val="single" w:sz="4" w:color="D9D9D9"/>
+            </w:tcBorders>
             <w:tcMar>
-              <w:top w:w="75" w:type="dxa"/>
-              <w:start w:w="90" w:type="dxa"/>
-              <w:bottom w:w="75" w:type="dxa"/>
-              <w:end w:w="90" w:type="dxa"/>
+              <w:top w:w="85" w:type="dxa"/>
+              <w:left w:w="85" w:type="dxa"/>
+              <w:bottom w:w="85" w:type="dxa"/>
+              <w:right w:w="85" w:type="dxa"/>
             </w:tcMar>
           </w:tcPr>
           <w:p>
             <w:pPr>
-              <w:spacing w:after="0"/>
+              <w:spacing w:after="60"/>
             </w:pPr>
             <w:r>
               <w:rPr>
-                <w:rFonts w:ascii="Tahoma" w:hAnsi="Tahoma" w:eastAsia="Tahoma"/>
-                <w:sz w:val="16"/>
+                <w:b w:val="0"/>
+                <w:sz w:val="18"/>
               </w:rPr>
-              <w:t xml:space="preserve">บังคับ รับ </w:t>
-            </w:r>
-            <w:r>
-              <w:rPr>
-                <w:rFonts w:ascii="Tahoma" w:hAnsi="Tahoma" w:eastAsia="Tahoma"/>
-                <w:color w:val="1F4E79"/>
-                <w:sz w:val="16"/>
-              </w:rPr>
-              <w:t>1</w:t>
-            </w:r>
-            <w:r>
-              <w:rPr>
-                <w:rFonts w:ascii="Tahoma" w:hAnsi="Tahoma" w:eastAsia="Tahoma"/>
-                <w:sz w:val="16"/>
-              </w:rPr>
-              <w:t xml:space="preserve">, </w:t>
-            </w:r>
-            <w:r>
-              <w:rPr>
-                <w:rFonts w:ascii="Tahoma" w:hAnsi="Tahoma" w:eastAsia="Tahoma"/>
-                <w:color w:val="1F4E79"/>
-                <w:sz w:val="16"/>
-              </w:rPr>
-              <w:t>2</w:t>
-            </w:r>
-            <w:r>
-              <w:rPr>
-                <w:rFonts w:ascii="Tahoma" w:hAnsi="Tahoma" w:eastAsia="Tahoma"/>
-                <w:sz w:val="16"/>
-              </w:rPr>
-              <w:t xml:space="preserve">, </w:t>
-            </w:r>
-            <w:r>
-              <w:rPr>
-                <w:rFonts w:ascii="Tahoma" w:hAnsi="Tahoma" w:eastAsia="Tahoma"/>
-                <w:color w:val="1F4E79"/>
-                <w:sz w:val="16"/>
-              </w:rPr>
-              <w:t>3</w:t>
-            </w:r>
-            <w:r>
-              <w:rPr>
-                <w:rFonts w:ascii="Tahoma" w:hAnsi="Tahoma" w:eastAsia="Tahoma"/>
-                <w:sz w:val="16"/>
-              </w:rPr>
-              <w:t xml:space="preserve"> โดย </w:t>
-            </w:r>
-            <w:r>
-              <w:rPr>
-                <w:rFonts w:ascii="Tahoma" w:hAnsi="Tahoma" w:eastAsia="Tahoma"/>
-                <w:color w:val="1F4E79"/>
-                <w:sz w:val="16"/>
-              </w:rPr>
-              <w:t>3</w:t>
-            </w:r>
-            <w:r>
-              <w:rPr>
-                <w:rFonts w:ascii="Tahoma" w:hAnsi="Tahoma" w:eastAsia="Tahoma"/>
-                <w:sz w:val="16"/>
-              </w:rPr>
-              <w:t xml:space="preserve"> หมายถึงภาคฤดูร้อนตาม API อ่านเดิม</w:t>
+              <w:t>บังคับ รับ 1, 2, 3 โดย 3 หมายถึงภาคฤดูร้อนตาม API อ่านเดิม</w:t>
             </w:r>
           </w:p>
         </w:tc>
       </w:tr>
       <w:tr>
+        <w:trPr>
+          <w:cantSplit/>
+        </w:trPr>
         <w:tc>
           <w:tcPr>
-            <w:tcW w:type="dxa" w:w="1728"/>
-            <w:vAlign w:val="center"/>
-            <w:shd w:fill="FFFFFF"/>
+            <w:tcW w:type="dxa" w:w="3346"/>
+            <w:tcBorders>
+              <w:top w:val="single" w:sz="4" w:color="D9D9D9"/>
+              <w:left w:val="single" w:sz="4" w:color="D9D9D9"/>
+              <w:bottom w:val="single" w:sz="4" w:color="D9D9D9"/>
+              <w:right w:val="single" w:sz="4" w:color="D9D9D9"/>
+            </w:tcBorders>
             <w:tcMar>
-              <w:top w:w="75" w:type="dxa"/>
-              <w:start w:w="90" w:type="dxa"/>
-              <w:bottom w:w="75" w:type="dxa"/>
-              <w:end w:w="90" w:type="dxa"/>
+              <w:top w:w="85" w:type="dxa"/>
+              <w:left w:w="85" w:type="dxa"/>
+              <w:bottom w:w="85" w:type="dxa"/>
+              <w:right w:w="85" w:type="dxa"/>
             </w:tcMar>
           </w:tcPr>
           <w:p>
             <w:pPr>
-              <w:spacing w:after="0"/>
+              <w:spacing w:after="60"/>
             </w:pPr>
             <w:r>
               <w:rPr>
-                <w:rFonts w:ascii="Tahoma" w:hAnsi="Tahoma" w:eastAsia="Tahoma"/>
-                <w:color w:val="1F4E79"/>
-                <w:sz w:val="16"/>
+                <w:b w:val="0"/>
+                <w:sz w:val="18"/>
               </w:rPr>
               <w:t>exam_period</w:t>
             </w:r>
@@ -604,24 +614,28 @@
         </w:tc>
         <w:tc>
           <w:tcPr>
-            <w:tcW w:type="dxa" w:w="1656"/>
-            <w:vAlign w:val="center"/>
-            <w:shd w:fill="FFFFFF"/>
+            <w:tcW w:type="dxa" w:w="3346"/>
+            <w:tcBorders>
+              <w:top w:val="single" w:sz="4" w:color="D9D9D9"/>
+              <w:left w:val="single" w:sz="4" w:color="D9D9D9"/>
+              <w:bottom w:val="single" w:sz="4" w:color="D9D9D9"/>
+              <w:right w:val="single" w:sz="4" w:color="D9D9D9"/>
+            </w:tcBorders>
             <w:tcMar>
-              <w:top w:w="75" w:type="dxa"/>
-              <w:start w:w="90" w:type="dxa"/>
-              <w:bottom w:w="75" w:type="dxa"/>
-              <w:end w:w="90" w:type="dxa"/>
+              <w:top w:w="85" w:type="dxa"/>
+              <w:left w:w="85" w:type="dxa"/>
+              <w:bottom w:w="85" w:type="dxa"/>
+              <w:right w:w="85" w:type="dxa"/>
             </w:tcMar>
           </w:tcPr>
           <w:p>
             <w:pPr>
-              <w:spacing w:after="0"/>
+              <w:spacing w:after="60"/>
             </w:pPr>
             <w:r>
               <w:rPr>
-                <w:rFonts w:ascii="Tahoma" w:hAnsi="Tahoma" w:eastAsia="Tahoma"/>
-                <w:sz w:val="16"/>
+                <w:b w:val="0"/>
+                <w:sz w:val="18"/>
               </w:rPr>
               <w:t>string</w:t>
             </w:r>
@@ -629,82 +643,62 @@
         </w:tc>
         <w:tc>
           <w:tcPr>
-            <w:tcW w:type="dxa" w:w="6480"/>
-            <w:vAlign w:val="center"/>
-            <w:shd w:fill="FFFFFF"/>
+            <w:tcW w:type="dxa" w:w="3346"/>
+            <w:tcBorders>
+              <w:top w:val="single" w:sz="4" w:color="D9D9D9"/>
+              <w:left w:val="single" w:sz="4" w:color="D9D9D9"/>
+              <w:bottom w:val="single" w:sz="4" w:color="D9D9D9"/>
+              <w:right w:val="single" w:sz="4" w:color="D9D9D9"/>
+            </w:tcBorders>
             <w:tcMar>
-              <w:top w:w="75" w:type="dxa"/>
-              <w:start w:w="90" w:type="dxa"/>
-              <w:bottom w:w="75" w:type="dxa"/>
-              <w:end w:w="90" w:type="dxa"/>
+              <w:top w:w="85" w:type="dxa"/>
+              <w:left w:w="85" w:type="dxa"/>
+              <w:bottom w:w="85" w:type="dxa"/>
+              <w:right w:w="85" w:type="dxa"/>
             </w:tcMar>
           </w:tcPr>
           <w:p>
             <w:pPr>
-              <w:spacing w:after="0"/>
+              <w:spacing w:after="60"/>
             </w:pPr>
             <w:r>
               <w:rPr>
-                <w:rFonts w:ascii="Tahoma" w:hAnsi="Tahoma" w:eastAsia="Tahoma"/>
-                <w:sz w:val="16"/>
+                <w:b w:val="0"/>
+                <w:sz w:val="18"/>
               </w:rPr>
-              <w:t xml:space="preserve">บังคับ รับ </w:t>
-            </w:r>
-            <w:r>
-              <w:rPr>
-                <w:rFonts w:ascii="Tahoma" w:hAnsi="Tahoma" w:eastAsia="Tahoma"/>
-                <w:color w:val="1F4E79"/>
-                <w:sz w:val="16"/>
-              </w:rPr>
-              <w:t>midterm</w:t>
-            </w:r>
-            <w:r>
-              <w:rPr>
-                <w:rFonts w:ascii="Tahoma" w:hAnsi="Tahoma" w:eastAsia="Tahoma"/>
-                <w:sz w:val="16"/>
-              </w:rPr>
-              <w:t xml:space="preserve"> หรือ </w:t>
-            </w:r>
-            <w:r>
-              <w:rPr>
-                <w:rFonts w:ascii="Tahoma" w:hAnsi="Tahoma" w:eastAsia="Tahoma"/>
-                <w:color w:val="1F4E79"/>
-                <w:sz w:val="16"/>
-              </w:rPr>
-              <w:t>final</w:t>
-            </w:r>
-            <w:r>
-              <w:rPr>
-                <w:rFonts w:ascii="Tahoma" w:hAnsi="Tahoma" w:eastAsia="Tahoma"/>
-                <w:sz w:val="16"/>
-              </w:rPr>
-              <w:t xml:space="preserve"> ตาม API อ่านเดิม</w:t>
+              <w:t>บังคับ รับ midterm หรือ final ตาม API อ่านเดิม</w:t>
             </w:r>
           </w:p>
         </w:tc>
       </w:tr>
       <w:tr>
+        <w:trPr>
+          <w:cantSplit/>
+        </w:trPr>
         <w:tc>
           <w:tcPr>
-            <w:tcW w:type="dxa" w:w="1728"/>
-            <w:vAlign w:val="center"/>
-            <w:shd w:fill="F3F6FA"/>
+            <w:tcW w:type="dxa" w:w="3346"/>
+            <w:tcBorders>
+              <w:top w:val="single" w:sz="4" w:color="D9D9D9"/>
+              <w:left w:val="single" w:sz="4" w:color="D9D9D9"/>
+              <w:bottom w:val="single" w:sz="4" w:color="D9D9D9"/>
+              <w:right w:val="single" w:sz="4" w:color="D9D9D9"/>
+            </w:tcBorders>
             <w:tcMar>
-              <w:top w:w="75" w:type="dxa"/>
-              <w:start w:w="90" w:type="dxa"/>
-              <w:bottom w:w="75" w:type="dxa"/>
-              <w:end w:w="90" w:type="dxa"/>
+              <w:top w:w="85" w:type="dxa"/>
+              <w:left w:w="85" w:type="dxa"/>
+              <w:bottom w:w="85" w:type="dxa"/>
+              <w:right w:w="85" w:type="dxa"/>
             </w:tcMar>
           </w:tcPr>
           <w:p>
             <w:pPr>
-              <w:spacing w:after="0"/>
+              <w:spacing w:after="60"/>
             </w:pPr>
             <w:r>
               <w:rPr>
-                <w:rFonts w:ascii="Tahoma" w:hAnsi="Tahoma" w:eastAsia="Tahoma"/>
-                <w:color w:val="1F4E79"/>
-                <w:sz w:val="16"/>
+                <w:b w:val="0"/>
+                <w:sz w:val="18"/>
               </w:rPr>
               <w:t>topics</w:t>
             </w:r>
@@ -712,24 +706,28 @@
         </w:tc>
         <w:tc>
           <w:tcPr>
-            <w:tcW w:type="dxa" w:w="1656"/>
-            <w:vAlign w:val="center"/>
-            <w:shd w:fill="F3F6FA"/>
+            <w:tcW w:type="dxa" w:w="3346"/>
+            <w:tcBorders>
+              <w:top w:val="single" w:sz="4" w:color="D9D9D9"/>
+              <w:left w:val="single" w:sz="4" w:color="D9D9D9"/>
+              <w:bottom w:val="single" w:sz="4" w:color="D9D9D9"/>
+              <w:right w:val="single" w:sz="4" w:color="D9D9D9"/>
+            </w:tcBorders>
             <w:tcMar>
-              <w:top w:w="75" w:type="dxa"/>
-              <w:start w:w="90" w:type="dxa"/>
-              <w:bottom w:w="75" w:type="dxa"/>
-              <w:end w:w="90" w:type="dxa"/>
+              <w:top w:w="85" w:type="dxa"/>
+              <w:left w:w="85" w:type="dxa"/>
+              <w:bottom w:w="85" w:type="dxa"/>
+              <w:right w:w="85" w:type="dxa"/>
             </w:tcMar>
           </w:tcPr>
           <w:p>
             <w:pPr>
-              <w:spacing w:after="0"/>
+              <w:spacing w:after="60"/>
             </w:pPr>
             <w:r>
               <w:rPr>
-                <w:rFonts w:ascii="Tahoma" w:hAnsi="Tahoma" w:eastAsia="Tahoma"/>
-                <w:sz w:val="16"/>
+                <w:b w:val="0"/>
+                <w:sz w:val="18"/>
               </w:rPr>
               <w:t>string</w:t>
             </w:r>
@@ -737,24 +735,28 @@
         </w:tc>
         <w:tc>
           <w:tcPr>
-            <w:tcW w:type="dxa" w:w="6480"/>
-            <w:vAlign w:val="center"/>
-            <w:shd w:fill="F3F6FA"/>
+            <w:tcW w:type="dxa" w:w="3346"/>
+            <w:tcBorders>
+              <w:top w:val="single" w:sz="4" w:color="D9D9D9"/>
+              <w:left w:val="single" w:sz="4" w:color="D9D9D9"/>
+              <w:bottom w:val="single" w:sz="4" w:color="D9D9D9"/>
+              <w:right w:val="single" w:sz="4" w:color="D9D9D9"/>
+            </w:tcBorders>
             <w:tcMar>
-              <w:top w:w="75" w:type="dxa"/>
-              <w:start w:w="90" w:type="dxa"/>
-              <w:bottom w:w="75" w:type="dxa"/>
-              <w:end w:w="90" w:type="dxa"/>
+              <w:top w:w="85" w:type="dxa"/>
+              <w:left w:w="85" w:type="dxa"/>
+              <w:bottom w:w="85" w:type="dxa"/>
+              <w:right w:w="85" w:type="dxa"/>
             </w:tcMar>
           </w:tcPr>
           <w:p>
             <w:pPr>
-              <w:spacing w:after="0"/>
+              <w:spacing w:after="60"/>
             </w:pPr>
             <w:r>
               <w:rPr>
-                <w:rFonts w:ascii="Tahoma" w:hAnsi="Tahoma" w:eastAsia="Tahoma"/>
-                <w:sz w:val="16"/>
+                <w:b w:val="0"/>
+                <w:sz w:val="18"/>
               </w:rPr>
               <w:t>บังคับ ห้ามเป็นค่าว่างหรือมีแต่ช่องว่าง ความยาวไม่เกิน 2,000 ตัวอักษรตาม Entity</w:t>
             </w:r>
@@ -762,27 +764,33 @@
         </w:tc>
       </w:tr>
       <w:tr>
+        <w:trPr>
+          <w:cantSplit/>
+        </w:trPr>
         <w:tc>
           <w:tcPr>
-            <w:tcW w:type="dxa" w:w="1728"/>
-            <w:vAlign w:val="center"/>
-            <w:shd w:fill="FFFFFF"/>
+            <w:tcW w:type="dxa" w:w="3346"/>
+            <w:tcBorders>
+              <w:top w:val="single" w:sz="4" w:color="D9D9D9"/>
+              <w:left w:val="single" w:sz="4" w:color="D9D9D9"/>
+              <w:bottom w:val="single" w:sz="4" w:color="D9D9D9"/>
+              <w:right w:val="single" w:sz="4" w:color="D9D9D9"/>
+            </w:tcBorders>
             <w:tcMar>
-              <w:top w:w="75" w:type="dxa"/>
-              <w:start w:w="90" w:type="dxa"/>
-              <w:bottom w:w="75" w:type="dxa"/>
-              <w:end w:w="90" w:type="dxa"/>
+              <w:top w:w="85" w:type="dxa"/>
+              <w:left w:w="85" w:type="dxa"/>
+              <w:bottom w:w="85" w:type="dxa"/>
+              <w:right w:w="85" w:type="dxa"/>
             </w:tcMar>
           </w:tcPr>
           <w:p>
             <w:pPr>
-              <w:spacing w:after="0"/>
+              <w:spacing w:after="60"/>
             </w:pPr>
             <w:r>
               <w:rPr>
-                <w:rFonts w:ascii="Tahoma" w:hAnsi="Tahoma" w:eastAsia="Tahoma"/>
-                <w:color w:val="1F4E79"/>
-                <w:sz w:val="16"/>
+                <w:b w:val="0"/>
+                <w:sz w:val="18"/>
               </w:rPr>
               <w:t>exam_format</w:t>
             </w:r>
@@ -790,24 +798,28 @@
         </w:tc>
         <w:tc>
           <w:tcPr>
-            <w:tcW w:type="dxa" w:w="1656"/>
-            <w:vAlign w:val="center"/>
-            <w:shd w:fill="FFFFFF"/>
+            <w:tcW w:type="dxa" w:w="3346"/>
+            <w:tcBorders>
+              <w:top w:val="single" w:sz="4" w:color="D9D9D9"/>
+              <w:left w:val="single" w:sz="4" w:color="D9D9D9"/>
+              <w:bottom w:val="single" w:sz="4" w:color="D9D9D9"/>
+              <w:right w:val="single" w:sz="4" w:color="D9D9D9"/>
+            </w:tcBorders>
             <w:tcMar>
-              <w:top w:w="75" w:type="dxa"/>
-              <w:start w:w="90" w:type="dxa"/>
-              <w:bottom w:w="75" w:type="dxa"/>
-              <w:end w:w="90" w:type="dxa"/>
+              <w:top w:w="85" w:type="dxa"/>
+              <w:left w:w="85" w:type="dxa"/>
+              <w:bottom w:w="85" w:type="dxa"/>
+              <w:right w:w="85" w:type="dxa"/>
             </w:tcMar>
           </w:tcPr>
           <w:p>
             <w:pPr>
-              <w:spacing w:after="0"/>
+              <w:spacing w:after="60"/>
             </w:pPr>
             <w:r>
               <w:rPr>
-                <w:rFonts w:ascii="Tahoma" w:hAnsi="Tahoma" w:eastAsia="Tahoma"/>
-                <w:sz w:val="16"/>
+                <w:b w:val="0"/>
+                <w:sz w:val="18"/>
               </w:rPr>
               <w:t>string</w:t>
             </w:r>
@@ -815,90 +827,62 @@
         </w:tc>
         <w:tc>
           <w:tcPr>
-            <w:tcW w:type="dxa" w:w="6480"/>
-            <w:vAlign w:val="center"/>
-            <w:shd w:fill="FFFFFF"/>
+            <w:tcW w:type="dxa" w:w="3346"/>
+            <w:tcBorders>
+              <w:top w:val="single" w:sz="4" w:color="D9D9D9"/>
+              <w:left w:val="single" w:sz="4" w:color="D9D9D9"/>
+              <w:bottom w:val="single" w:sz="4" w:color="D9D9D9"/>
+              <w:right w:val="single" w:sz="4" w:color="D9D9D9"/>
+            </w:tcBorders>
             <w:tcMar>
-              <w:top w:w="75" w:type="dxa"/>
-              <w:start w:w="90" w:type="dxa"/>
-              <w:bottom w:w="75" w:type="dxa"/>
-              <w:end w:w="90" w:type="dxa"/>
+              <w:top w:w="85" w:type="dxa"/>
+              <w:left w:w="85" w:type="dxa"/>
+              <w:bottom w:w="85" w:type="dxa"/>
+              <w:right w:w="85" w:type="dxa"/>
             </w:tcMar>
           </w:tcPr>
           <w:p>
             <w:pPr>
-              <w:spacing w:after="0"/>
+              <w:spacing w:after="60"/>
             </w:pPr>
             <w:r>
               <w:rPr>
-                <w:rFonts w:ascii="Tahoma" w:hAnsi="Tahoma" w:eastAsia="Tahoma"/>
-                <w:sz w:val="16"/>
+                <w:b w:val="0"/>
+                <w:sz w:val="18"/>
               </w:rPr>
-              <w:t xml:space="preserve">บังคับ เลือกจาก Dropdown ค่า </w:t>
-            </w:r>
-            <w:r>
-              <w:rPr>
-                <w:rFonts w:ascii="Tahoma" w:hAnsi="Tahoma" w:eastAsia="Tahoma"/>
-                <w:color w:val="1F4E79"/>
-                <w:sz w:val="16"/>
-              </w:rPr>
-              <w:t>objective</w:t>
-            </w:r>
-            <w:r>
-              <w:rPr>
-                <w:rFonts w:ascii="Tahoma" w:hAnsi="Tahoma" w:eastAsia="Tahoma"/>
-                <w:sz w:val="16"/>
-              </w:rPr>
-              <w:t xml:space="preserve">, </w:t>
-            </w:r>
-            <w:r>
-              <w:rPr>
-                <w:rFonts w:ascii="Tahoma" w:hAnsi="Tahoma" w:eastAsia="Tahoma"/>
-                <w:color w:val="1F4E79"/>
-                <w:sz w:val="16"/>
-              </w:rPr>
-              <w:t>subjective</w:t>
-            </w:r>
-            <w:r>
-              <w:rPr>
-                <w:rFonts w:ascii="Tahoma" w:hAnsi="Tahoma" w:eastAsia="Tahoma"/>
-                <w:sz w:val="16"/>
-              </w:rPr>
-              <w:t xml:space="preserve"> หรือ </w:t>
-            </w:r>
-            <w:r>
-              <w:rPr>
-                <w:rFonts w:ascii="Tahoma" w:hAnsi="Tahoma" w:eastAsia="Tahoma"/>
-                <w:color w:val="1F4E79"/>
-                <w:sz w:val="16"/>
-              </w:rPr>
-              <w:t>mixed</w:t>
+              <w:t>บังคับ เลือกจาก Dropdown ค่า objective, subjective หรือ mixed</w:t>
             </w:r>
           </w:p>
         </w:tc>
       </w:tr>
       <w:tr>
+        <w:trPr>
+          <w:cantSplit/>
+        </w:trPr>
         <w:tc>
           <w:tcPr>
-            <w:tcW w:type="dxa" w:w="1728"/>
-            <w:vAlign w:val="center"/>
-            <w:shd w:fill="F3F6FA"/>
+            <w:tcW w:type="dxa" w:w="3346"/>
+            <w:tcBorders>
+              <w:top w:val="single" w:sz="4" w:color="D9D9D9"/>
+              <w:left w:val="single" w:sz="4" w:color="D9D9D9"/>
+              <w:bottom w:val="single" w:sz="4" w:color="D9D9D9"/>
+              <w:right w:val="single" w:sz="4" w:color="D9D9D9"/>
+            </w:tcBorders>
             <w:tcMar>
-              <w:top w:w="75" w:type="dxa"/>
-              <w:start w:w="90" w:type="dxa"/>
-              <w:bottom w:w="75" w:type="dxa"/>
-              <w:end w:w="90" w:type="dxa"/>
+              <w:top w:w="85" w:type="dxa"/>
+              <w:left w:w="85" w:type="dxa"/>
+              <w:bottom w:w="85" w:type="dxa"/>
+              <w:right w:w="85" w:type="dxa"/>
             </w:tcMar>
           </w:tcPr>
           <w:p>
             <w:pPr>
-              <w:spacing w:after="0"/>
+              <w:spacing w:after="60"/>
             </w:pPr>
             <w:r>
               <w:rPr>
-                <w:rFonts w:ascii="Tahoma" w:hAnsi="Tahoma" w:eastAsia="Tahoma"/>
-                <w:color w:val="1F4E79"/>
-                <w:sz w:val="16"/>
+                <w:b w:val="0"/>
+                <w:sz w:val="18"/>
               </w:rPr>
               <w:t>objective_count</w:t>
             </w:r>
@@ -906,24 +890,28 @@
         </w:tc>
         <w:tc>
           <w:tcPr>
-            <w:tcW w:type="dxa" w:w="1656"/>
-            <w:vAlign w:val="center"/>
-            <w:shd w:fill="F3F6FA"/>
+            <w:tcW w:type="dxa" w:w="3346"/>
+            <w:tcBorders>
+              <w:top w:val="single" w:sz="4" w:color="D9D9D9"/>
+              <w:left w:val="single" w:sz="4" w:color="D9D9D9"/>
+              <w:bottom w:val="single" w:sz="4" w:color="D9D9D9"/>
+              <w:right w:val="single" w:sz="4" w:color="D9D9D9"/>
+            </w:tcBorders>
             <w:tcMar>
-              <w:top w:w="75" w:type="dxa"/>
-              <w:start w:w="90" w:type="dxa"/>
-              <w:bottom w:w="75" w:type="dxa"/>
-              <w:end w:w="90" w:type="dxa"/>
+              <w:top w:w="85" w:type="dxa"/>
+              <w:left w:w="85" w:type="dxa"/>
+              <w:bottom w:w="85" w:type="dxa"/>
+              <w:right w:w="85" w:type="dxa"/>
             </w:tcMar>
           </w:tcPr>
           <w:p>
             <w:pPr>
-              <w:spacing w:after="0"/>
+              <w:spacing w:after="60"/>
             </w:pPr>
             <w:r>
               <w:rPr>
-                <w:rFonts w:ascii="Tahoma" w:hAnsi="Tahoma" w:eastAsia="Tahoma"/>
-                <w:sz w:val="16"/>
+                <w:b w:val="0"/>
+                <w:sz w:val="18"/>
               </w:rPr>
               <w:t>integer หรือ null</w:t>
             </w:r>
@@ -931,24 +919,28 @@
         </w:tc>
         <w:tc>
           <w:tcPr>
-            <w:tcW w:type="dxa" w:w="6480"/>
-            <w:vAlign w:val="center"/>
-            <w:shd w:fill="F3F6FA"/>
+            <w:tcW w:type="dxa" w:w="3346"/>
+            <w:tcBorders>
+              <w:top w:val="single" w:sz="4" w:color="D9D9D9"/>
+              <w:left w:val="single" w:sz="4" w:color="D9D9D9"/>
+              <w:bottom w:val="single" w:sz="4" w:color="D9D9D9"/>
+              <w:right w:val="single" w:sz="4" w:color="D9D9D9"/>
+            </w:tcBorders>
             <w:tcMar>
-              <w:top w:w="75" w:type="dxa"/>
-              <w:start w:w="90" w:type="dxa"/>
-              <w:bottom w:w="75" w:type="dxa"/>
-              <w:end w:w="90" w:type="dxa"/>
+              <w:top w:w="85" w:type="dxa"/>
+              <w:left w:w="85" w:type="dxa"/>
+              <w:bottom w:w="85" w:type="dxa"/>
+              <w:right w:w="85" w:type="dxa"/>
             </w:tcMar>
           </w:tcPr>
           <w:p>
             <w:pPr>
-              <w:spacing w:after="0"/>
+              <w:spacing w:after="60"/>
             </w:pPr>
             <w:r>
               <w:rPr>
-                <w:rFonts w:ascii="Tahoma" w:hAnsi="Tahoma" w:eastAsia="Tahoma"/>
-                <w:sz w:val="16"/>
+                <w:b w:val="0"/>
+                <w:sz w:val="18"/>
               </w:rPr>
               <w:t>จำนวนข้อปรนัย ถ้าระบุให้มากกว่า 0 เก็บตาม Entity เดิม</w:t>
             </w:r>
@@ -956,27 +948,33 @@
         </w:tc>
       </w:tr>
       <w:tr>
+        <w:trPr>
+          <w:cantSplit/>
+        </w:trPr>
         <w:tc>
           <w:tcPr>
-            <w:tcW w:type="dxa" w:w="1728"/>
-            <w:vAlign w:val="center"/>
-            <w:shd w:fill="FFFFFF"/>
+            <w:tcW w:type="dxa" w:w="3346"/>
+            <w:tcBorders>
+              <w:top w:val="single" w:sz="4" w:color="D9D9D9"/>
+              <w:left w:val="single" w:sz="4" w:color="D9D9D9"/>
+              <w:bottom w:val="single" w:sz="4" w:color="D9D9D9"/>
+              <w:right w:val="single" w:sz="4" w:color="D9D9D9"/>
+            </w:tcBorders>
             <w:tcMar>
-              <w:top w:w="75" w:type="dxa"/>
-              <w:start w:w="90" w:type="dxa"/>
-              <w:bottom w:w="75" w:type="dxa"/>
-              <w:end w:w="90" w:type="dxa"/>
+              <w:top w:w="85" w:type="dxa"/>
+              <w:left w:w="85" w:type="dxa"/>
+              <w:bottom w:w="85" w:type="dxa"/>
+              <w:right w:w="85" w:type="dxa"/>
             </w:tcMar>
           </w:tcPr>
           <w:p>
             <w:pPr>
-              <w:spacing w:after="0"/>
+              <w:spacing w:after="60"/>
             </w:pPr>
             <w:r>
               <w:rPr>
-                <w:rFonts w:ascii="Tahoma" w:hAnsi="Tahoma" w:eastAsia="Tahoma"/>
-                <w:color w:val="1F4E79"/>
-                <w:sz w:val="16"/>
+                <w:b w:val="0"/>
+                <w:sz w:val="18"/>
               </w:rPr>
               <w:t>subjective_count</w:t>
             </w:r>
@@ -984,24 +982,28 @@
         </w:tc>
         <w:tc>
           <w:tcPr>
-            <w:tcW w:type="dxa" w:w="1656"/>
-            <w:vAlign w:val="center"/>
-            <w:shd w:fill="FFFFFF"/>
+            <w:tcW w:type="dxa" w:w="3346"/>
+            <w:tcBorders>
+              <w:top w:val="single" w:sz="4" w:color="D9D9D9"/>
+              <w:left w:val="single" w:sz="4" w:color="D9D9D9"/>
+              <w:bottom w:val="single" w:sz="4" w:color="D9D9D9"/>
+              <w:right w:val="single" w:sz="4" w:color="D9D9D9"/>
+            </w:tcBorders>
             <w:tcMar>
-              <w:top w:w="75" w:type="dxa"/>
-              <w:start w:w="90" w:type="dxa"/>
-              <w:bottom w:w="75" w:type="dxa"/>
-              <w:end w:w="90" w:type="dxa"/>
+              <w:top w:w="85" w:type="dxa"/>
+              <w:left w:w="85" w:type="dxa"/>
+              <w:bottom w:w="85" w:type="dxa"/>
+              <w:right w:w="85" w:type="dxa"/>
             </w:tcMar>
           </w:tcPr>
           <w:p>
             <w:pPr>
-              <w:spacing w:after="0"/>
+              <w:spacing w:after="60"/>
             </w:pPr>
             <w:r>
               <w:rPr>
-                <w:rFonts w:ascii="Tahoma" w:hAnsi="Tahoma" w:eastAsia="Tahoma"/>
-                <w:sz w:val="16"/>
+                <w:b w:val="0"/>
+                <w:sz w:val="18"/>
               </w:rPr>
               <w:t>integer หรือ null</w:t>
             </w:r>
@@ -1009,24 +1011,28 @@
         </w:tc>
         <w:tc>
           <w:tcPr>
-            <w:tcW w:type="dxa" w:w="6480"/>
-            <w:vAlign w:val="center"/>
-            <w:shd w:fill="FFFFFF"/>
+            <w:tcW w:type="dxa" w:w="3346"/>
+            <w:tcBorders>
+              <w:top w:val="single" w:sz="4" w:color="D9D9D9"/>
+              <w:left w:val="single" w:sz="4" w:color="D9D9D9"/>
+              <w:bottom w:val="single" w:sz="4" w:color="D9D9D9"/>
+              <w:right w:val="single" w:sz="4" w:color="D9D9D9"/>
+            </w:tcBorders>
             <w:tcMar>
-              <w:top w:w="75" w:type="dxa"/>
-              <w:start w:w="90" w:type="dxa"/>
-              <w:bottom w:w="75" w:type="dxa"/>
-              <w:end w:w="90" w:type="dxa"/>
+              <w:top w:w="85" w:type="dxa"/>
+              <w:left w:w="85" w:type="dxa"/>
+              <w:bottom w:w="85" w:type="dxa"/>
+              <w:right w:w="85" w:type="dxa"/>
             </w:tcMar>
           </w:tcPr>
           <w:p>
             <w:pPr>
-              <w:spacing w:after="0"/>
+              <w:spacing w:after="60"/>
             </w:pPr>
             <w:r>
               <w:rPr>
-                <w:rFonts w:ascii="Tahoma" w:hAnsi="Tahoma" w:eastAsia="Tahoma"/>
-                <w:sz w:val="16"/>
+                <w:b w:val="0"/>
+                <w:sz w:val="18"/>
               </w:rPr>
               <w:t>จำนวนข้ออัตนัย ถ้าระบุให้มากกว่า 0 เก็บตาม Entity เดิม</w:t>
             </w:r>
@@ -1034,27 +1040,33 @@
         </w:tc>
       </w:tr>
       <w:tr>
+        <w:trPr>
+          <w:cantSplit/>
+        </w:trPr>
         <w:tc>
           <w:tcPr>
-            <w:tcW w:type="dxa" w:w="1728"/>
-            <w:vAlign w:val="center"/>
-            <w:shd w:fill="F3F6FA"/>
+            <w:tcW w:type="dxa" w:w="3346"/>
+            <w:tcBorders>
+              <w:top w:val="single" w:sz="4" w:color="D9D9D9"/>
+              <w:left w:val="single" w:sz="4" w:color="D9D9D9"/>
+              <w:bottom w:val="single" w:sz="4" w:color="D9D9D9"/>
+              <w:right w:val="single" w:sz="4" w:color="D9D9D9"/>
+            </w:tcBorders>
             <w:tcMar>
-              <w:top w:w="75" w:type="dxa"/>
-              <w:start w:w="90" w:type="dxa"/>
-              <w:bottom w:w="75" w:type="dxa"/>
-              <w:end w:w="90" w:type="dxa"/>
+              <w:top w:w="85" w:type="dxa"/>
+              <w:left w:w="85" w:type="dxa"/>
+              <w:bottom w:w="85" w:type="dxa"/>
+              <w:right w:w="85" w:type="dxa"/>
             </w:tcMar>
           </w:tcPr>
           <w:p>
             <w:pPr>
-              <w:spacing w:after="0"/>
+              <w:spacing w:after="60"/>
             </w:pPr>
             <w:r>
               <w:rPr>
-                <w:rFonts w:ascii="Tahoma" w:hAnsi="Tahoma" w:eastAsia="Tahoma"/>
-                <w:color w:val="1F4E79"/>
-                <w:sz w:val="16"/>
+                <w:b w:val="0"/>
+                <w:sz w:val="18"/>
               </w:rPr>
               <w:t>additional_advice</w:t>
             </w:r>
@@ -1062,24 +1074,28 @@
         </w:tc>
         <w:tc>
           <w:tcPr>
-            <w:tcW w:type="dxa" w:w="1656"/>
-            <w:vAlign w:val="center"/>
-            <w:shd w:fill="F3F6FA"/>
+            <w:tcW w:type="dxa" w:w="3346"/>
+            <w:tcBorders>
+              <w:top w:val="single" w:sz="4" w:color="D9D9D9"/>
+              <w:left w:val="single" w:sz="4" w:color="D9D9D9"/>
+              <w:bottom w:val="single" w:sz="4" w:color="D9D9D9"/>
+              <w:right w:val="single" w:sz="4" w:color="D9D9D9"/>
+            </w:tcBorders>
             <w:tcMar>
-              <w:top w:w="75" w:type="dxa"/>
-              <w:start w:w="90" w:type="dxa"/>
-              <w:bottom w:w="75" w:type="dxa"/>
-              <w:end w:w="90" w:type="dxa"/>
+              <w:top w:w="85" w:type="dxa"/>
+              <w:left w:w="85" w:type="dxa"/>
+              <w:bottom w:w="85" w:type="dxa"/>
+              <w:right w:w="85" w:type="dxa"/>
             </w:tcMar>
           </w:tcPr>
           <w:p>
             <w:pPr>
-              <w:spacing w:after="0"/>
+              <w:spacing w:after="60"/>
             </w:pPr>
             <w:r>
               <w:rPr>
-                <w:rFonts w:ascii="Tahoma" w:hAnsi="Tahoma" w:eastAsia="Tahoma"/>
-                <w:sz w:val="16"/>
+                <w:b w:val="0"/>
+                <w:sz w:val="18"/>
               </w:rPr>
               <w:t>string หรือ null</w:t>
             </w:r>
@@ -1087,24 +1103,28 @@
         </w:tc>
         <w:tc>
           <w:tcPr>
-            <w:tcW w:type="dxa" w:w="6480"/>
-            <w:vAlign w:val="center"/>
-            <w:shd w:fill="F3F6FA"/>
+            <w:tcW w:type="dxa" w:w="3346"/>
+            <w:tcBorders>
+              <w:top w:val="single" w:sz="4" w:color="D9D9D9"/>
+              <w:left w:val="single" w:sz="4" w:color="D9D9D9"/>
+              <w:bottom w:val="single" w:sz="4" w:color="D9D9D9"/>
+              <w:right w:val="single" w:sz="4" w:color="D9D9D9"/>
+            </w:tcBorders>
             <w:tcMar>
-              <w:top w:w="75" w:type="dxa"/>
-              <w:start w:w="90" w:type="dxa"/>
-              <w:bottom w:w="75" w:type="dxa"/>
-              <w:end w:w="90" w:type="dxa"/>
+              <w:top w:w="85" w:type="dxa"/>
+              <w:left w:w="85" w:type="dxa"/>
+              <w:bottom w:w="85" w:type="dxa"/>
+              <w:right w:w="85" w:type="dxa"/>
             </w:tcMar>
           </w:tcPr>
           <w:p>
             <w:pPr>
-              <w:spacing w:after="0"/>
+              <w:spacing w:after="60"/>
             </w:pPr>
             <w:r>
               <w:rPr>
-                <w:rFonts w:ascii="Tahoma" w:hAnsi="Tahoma" w:eastAsia="Tahoma"/>
-                <w:sz w:val="16"/>
+                <w:b w:val="0"/>
+                <w:sz w:val="18"/>
               </w:rPr>
               <w:t>ไม่บังคับ ความยาวไม่เกิน 2,000 ตัวอักษรตาม Entity</w:t>
             </w:r>
@@ -1112,71 +1132,15 @@
         </w:tc>
       </w:tr>
     </w:tbl>
-    <w:p>
-      <w:pPr>
-        <w:spacing w:after="20"/>
-      </w:pPr>
-    </w:p>
+    <w:p/>
     <w:p>
       <w:r>
-        <w:t xml:space="preserve">ไม่รับ </w:t>
-      </w:r>
-      <w:r>
-        <w:rPr>
-          <w:rFonts w:ascii="Consolas" w:hAnsi="Consolas"/>
-          <w:color w:val="1F4E79"/>
-          <w:sz w:val="17"/>
-        </w:rPr>
-        <w:t>publisher_id</w:t>
-      </w:r>
-      <w:r>
-        <w:t xml:space="preserve"> จาก Request เพราะผู้ใช้ไม่ควรกำหนดเจ้าของรายการเอง ชื่อผู้สอนก็ไม่รับจากฟอร์ม โดยอ่านจากข้อมูลรายวิชาในระบบ</w:t>
+        <w:t>ไม่รับ publisher_id จาก Request เพราะผู้ใช้ไม่ควรกำหนดเจ้าของรายการเอง ชื่อผู้สอนก็ไม่รับจากฟอร์ม โดยอ่านจากข้อมูลรายวิชาในระบบ</w:t>
       </w:r>
     </w:p>
     <w:p>
       <w:r>
-        <w:t xml:space="preserve">รูปแบบ Request นี้ตรงกับ Entity ปัจจุบัน โดย Dropdown เลือก </w:t>
-      </w:r>
-      <w:r>
-        <w:rPr>
-          <w:rFonts w:ascii="Consolas" w:hAnsi="Consolas"/>
-          <w:color w:val="1F4E79"/>
-          <w:sz w:val="17"/>
-        </w:rPr>
-        <w:t>exam_format</w:t>
-      </w:r>
-      <w:r>
-        <w:t xml:space="preserve"> ได้หนึ่งค่าและไม่มีตัวเลือก </w:t>
-      </w:r>
-      <w:r>
-        <w:rPr>
-          <w:rFonts w:ascii="Consolas" w:hAnsi="Consolas"/>
-          <w:color w:val="1F4E79"/>
-          <w:sz w:val="17"/>
-        </w:rPr>
-        <w:t>other</w:t>
-      </w:r>
-      <w:r>
-        <w:t xml:space="preserve"> ส่วนจำนวนข้อปรนัยและอัตนัยเก็บแยกใน </w:t>
-      </w:r>
-      <w:r>
-        <w:rPr>
-          <w:rFonts w:ascii="Consolas" w:hAnsi="Consolas"/>
-          <w:color w:val="1F4E79"/>
-          <w:sz w:val="17"/>
-        </w:rPr>
-        <w:t>objective_count</w:t>
-      </w:r>
-      <w:r>
-        <w:t xml:space="preserve"> และ </w:t>
-      </w:r>
-      <w:r>
-        <w:rPr>
-          <w:rFonts w:ascii="Consolas" w:hAnsi="Consolas"/>
-          <w:color w:val="1F4E79"/>
-          <w:sz w:val="17"/>
-        </w:rPr>
-        <w:t>subjective_count</w:t>
+        <w:t>รูปแบบ Request นี้ตรงกับ Entity ปัจจุบัน โดย Dropdown เลือก exam_format ได้หนึ่งค่าและไม่มีตัวเลือก other ส่วนจำนวนข้อปรนัยและอัตนัยเก็บแยกใน objective_count และ subjective_count</w:t>
       </w:r>
     </w:p>
     <w:p>
@@ -1189,53 +1153,18 @@
     </w:p>
     <w:p>
       <w:r>
-        <w:t xml:space="preserve">ตอบ </w:t>
-      </w:r>
-      <w:r>
-        <w:rPr>
-          <w:rFonts w:ascii="Consolas" w:hAnsi="Consolas"/>
-          <w:color w:val="1F4E79"/>
-          <w:sz w:val="17"/>
-        </w:rPr>
-        <w:t>201 Created</w:t>
-      </w:r>
-      <w:r>
-        <w:t xml:space="preserve"> เมื่อสร้างรายการสำเร็จ โดย Response ใช้โครงสร้างรายละเอียดที่อ่านได้จาก </w:t>
-      </w:r>
-      <w:r>
-        <w:rPr>
-          <w:rFonts w:ascii="Consolas" w:hAnsi="Consolas"/>
-          <w:color w:val="1F4E79"/>
-          <w:sz w:val="17"/>
-        </w:rPr>
-        <w:t>GET /guides/{guide_id}</w:t>
-      </w:r>
-      <w:r>
-        <w:t xml:space="preserve"> และมี </w:t>
-      </w:r>
-      <w:r>
-        <w:rPr>
-          <w:rFonts w:ascii="Consolas" w:hAnsi="Consolas"/>
-          <w:color w:val="1F4E79"/>
-          <w:sz w:val="17"/>
-        </w:rPr>
-        <w:t>id</w:t>
-      </w:r>
-      <w:r>
-        <w:t xml:space="preserve"> ของรายการที่สร้าง</w:t>
+        <w:t>ตอบ 201 Created เมื่อสร้างรายการสำเร็จ โดย Response ใช้โครงสร้างรายละเอียดที่อ่านได้จาก GET /guides/{guide_id} และมี id ของรายการที่สร้าง</w:t>
       </w:r>
     </w:p>
     <w:p>
       <w:pPr>
+        <w:keepLines/>
         <w:spacing w:after="120"/>
-        <w:ind w:left="173"/>
-        <w:shd w:fill="F3F5F7"/>
       </w:pPr>
       <w:r>
         <w:rPr>
           <w:rFonts w:ascii="Consolas" w:hAnsi="Consolas"/>
-          <w:color w:val="2D3748"/>
-          <w:sz w:val="16"/>
+          <w:sz w:val="18"/>
         </w:rPr>
         <w:t>{</w:t>
         <w:br/>
@@ -1257,9 +1186,9 @@
         <w:br/>
         <w:t xml:space="preserve">    "course_code": "CS261",</w:t>
         <w:br/>
-        <w:t xml:space="preserve">    "course_name": "โครงสร้างข้อมูล",</w:t>
+        <w:t xml:space="preserve">    "course_name": "INTRODUCTION TO SOFTWARE ENGINEERING",</w:t>
         <w:br/>
-        <w:t xml:space="preserve">    "instructor_names": "ชื่อผู้สอนจากข้อมูลรายวิชา"</w:t>
+        <w:t xml:space="preserve">    "instructor_names": null</w:t>
         <w:br/>
         <w:t xml:space="preserve">  },</w:t>
         <w:br/>
@@ -1278,18 +1207,7 @@
     </w:p>
     <w:p>
       <w:r>
-        <w:t xml:space="preserve">Response DTO ควรใช้ </w:t>
-      </w:r>
-      <w:r>
-        <w:rPr>
-          <w:rFonts w:ascii="Consolas" w:hAnsi="Consolas"/>
-          <w:color w:val="1F4E79"/>
-          <w:sz w:val="17"/>
-        </w:rPr>
-        <w:t>GuideDetailResponseDTO</w:t>
-      </w:r>
-      <w:r>
-        <w:t xml:space="preserve"> ที่มีอยู่ เพื่อให้หน้าสำเร็จสามารถเปิดหน้ารายละเอียดด้วย ID ที่ได้</w:t>
+        <w:t>Response ใช้ GuideDetailResponseDTO หน้าเว็บจึงเปิดรายละเอียดด้วย ID ที่สร้างได้ทันที</w:t>
       </w:r>
     </w:p>
     <w:p>
@@ -1302,31 +1220,18 @@
     </w:p>
     <w:p>
       <w:r>
-        <w:t>ใช้โครงสร้าง Error DTO เดียวกับ API อ่านแนวข้อสอบ (</w:t>
-      </w:r>
-      <w:r>
-        <w:rPr>
-          <w:rFonts w:ascii="Consolas" w:hAnsi="Consolas"/>
-          <w:color w:val="1F4E79"/>
-          <w:sz w:val="17"/>
-        </w:rPr>
-        <w:t>ErrorResponseDTO</w:t>
-      </w:r>
-      <w:r>
-        <w:t>) เพื่อให้รูปแบบข้อผิดพลาดสม่ำเสมอ</w:t>
+        <w:t>ใช้โครงสร้าง Error DTO เดียวกับ API อ่านแนวข้อสอบ (ErrorResponseDTO) เพื่อให้รูปแบบข้อผิดพลาดสม่ำเสมอ</w:t>
       </w:r>
     </w:p>
     <w:p>
       <w:pPr>
+        <w:keepLines/>
         <w:spacing w:after="120"/>
-        <w:ind w:left="173"/>
-        <w:shd w:fill="F3F5F7"/>
       </w:pPr>
       <w:r>
         <w:rPr>
           <w:rFonts w:ascii="Consolas" w:hAnsi="Consolas"/>
-          <w:color w:val="2D3748"/>
-          <w:sz w:val="16"/>
+          <w:sz w:val="18"/>
         </w:rPr>
         <w:t>{</w:t>
         <w:br/>
@@ -1356,38 +1261,44 @@
     <w:tbl>
       <w:tblPr>
         <w:tblW w:type="auto" w:w="0"/>
-        <w:jc w:val="center"/>
-        <w:tblLayout w:type="fixed"/>
+        <w:tblLayout w:type="autofit"/>
         <w:tblLook w:firstColumn="1" w:firstRow="1" w:lastColumn="0" w:lastRow="0" w:noHBand="0" w:noVBand="1" w:val="04A0"/>
       </w:tblPr>
       <w:tblGrid>
-        <w:gridCol w:w="3389"/>
-        <w:gridCol w:w="3389"/>
-        <w:gridCol w:w="3389"/>
+        <w:gridCol w:w="3346"/>
+        <w:gridCol w:w="3346"/>
+        <w:gridCol w:w="3346"/>
       </w:tblGrid>
       <w:tr>
+        <w:trPr>
+          <w:cantSplit/>
+          <w:tblHeader/>
+        </w:trPr>
         <w:tc>
           <w:tcPr>
-            <w:tcW w:type="dxa" w:w="1728"/>
-            <w:vAlign w:val="center"/>
-            <w:shd w:fill="1F4E78"/>
+            <w:tcW w:type="dxa" w:w="3346"/>
+            <w:tcBorders>
+              <w:top w:val="single" w:sz="4" w:color="D9D9D9"/>
+              <w:left w:val="single" w:sz="4" w:color="D9D9D9"/>
+              <w:bottom w:val="single" w:sz="4" w:color="D9D9D9"/>
+              <w:right w:val="single" w:sz="4" w:color="D9D9D9"/>
+            </w:tcBorders>
             <w:tcMar>
-              <w:top w:w="75" w:type="dxa"/>
-              <w:start w:w="90" w:type="dxa"/>
-              <w:bottom w:w="75" w:type="dxa"/>
-              <w:end w:w="90" w:type="dxa"/>
+              <w:top w:w="85" w:type="dxa"/>
+              <w:left w:w="85" w:type="dxa"/>
+              <w:bottom w:w="85" w:type="dxa"/>
+              <w:right w:w="85" w:type="dxa"/>
             </w:tcMar>
+            <w:shd w:fill="E8EEF4"/>
           </w:tcPr>
           <w:p>
             <w:pPr>
-              <w:spacing w:after="0"/>
+              <w:spacing w:after="60"/>
             </w:pPr>
             <w:r>
               <w:rPr>
-                <w:rFonts w:ascii="Tahoma" w:hAnsi="Tahoma" w:eastAsia="Tahoma"/>
                 <w:b/>
-                <w:color w:val="FFFFFF"/>
-                <w:sz w:val="16"/>
+                <w:sz w:val="18"/>
               </w:rPr>
               <w:t>HTTP</w:t>
             </w:r>
@@ -1395,53 +1306,59 @@
         </w:tc>
         <w:tc>
           <w:tcPr>
-            <w:tcW w:type="dxa" w:w="1656"/>
-            <w:vAlign w:val="center"/>
-            <w:shd w:fill="1F4E78"/>
+            <w:tcW w:type="dxa" w:w="3346"/>
+            <w:tcBorders>
+              <w:top w:val="single" w:sz="4" w:color="D9D9D9"/>
+              <w:left w:val="single" w:sz="4" w:color="D9D9D9"/>
+              <w:bottom w:val="single" w:sz="4" w:color="D9D9D9"/>
+              <w:right w:val="single" w:sz="4" w:color="D9D9D9"/>
+            </w:tcBorders>
             <w:tcMar>
-              <w:top w:w="75" w:type="dxa"/>
-              <w:start w:w="90" w:type="dxa"/>
-              <w:bottom w:w="75" w:type="dxa"/>
-              <w:end w:w="90" w:type="dxa"/>
+              <w:top w:w="85" w:type="dxa"/>
+              <w:left w:w="85" w:type="dxa"/>
+              <w:bottom w:w="85" w:type="dxa"/>
+              <w:right w:w="85" w:type="dxa"/>
             </w:tcMar>
+            <w:shd w:fill="E8EEF4"/>
           </w:tcPr>
           <w:p>
             <w:pPr>
-              <w:spacing w:after="0"/>
+              <w:spacing w:after="60"/>
             </w:pPr>
             <w:r>
               <w:rPr>
-                <w:rFonts w:ascii="Tahoma" w:hAnsi="Tahoma" w:eastAsia="Tahoma"/>
                 <w:b/>
-                <w:color w:val="FFFFFF"/>
-                <w:sz w:val="16"/>
+                <w:sz w:val="18"/>
               </w:rPr>
-              <w:t>Code ที่เสนอ</w:t>
+              <w:t>error.code</w:t>
             </w:r>
           </w:p>
         </w:tc>
         <w:tc>
           <w:tcPr>
-            <w:tcW w:type="dxa" w:w="6480"/>
-            <w:vAlign w:val="center"/>
-            <w:shd w:fill="1F4E78"/>
+            <w:tcW w:type="dxa" w:w="3346"/>
+            <w:tcBorders>
+              <w:top w:val="single" w:sz="4" w:color="D9D9D9"/>
+              <w:left w:val="single" w:sz="4" w:color="D9D9D9"/>
+              <w:bottom w:val="single" w:sz="4" w:color="D9D9D9"/>
+              <w:right w:val="single" w:sz="4" w:color="D9D9D9"/>
+            </w:tcBorders>
             <w:tcMar>
-              <w:top w:w="75" w:type="dxa"/>
-              <w:start w:w="90" w:type="dxa"/>
-              <w:bottom w:w="75" w:type="dxa"/>
-              <w:end w:w="90" w:type="dxa"/>
+              <w:top w:w="85" w:type="dxa"/>
+              <w:left w:w="85" w:type="dxa"/>
+              <w:bottom w:w="85" w:type="dxa"/>
+              <w:right w:w="85" w:type="dxa"/>
             </w:tcMar>
+            <w:shd w:fill="E8EEF4"/>
           </w:tcPr>
           <w:p>
             <w:pPr>
-              <w:spacing w:after="0"/>
+              <w:spacing w:after="60"/>
             </w:pPr>
             <w:r>
               <w:rPr>
-                <w:rFonts w:ascii="Tahoma" w:hAnsi="Tahoma" w:eastAsia="Tahoma"/>
                 <w:b/>
-                <w:color w:val="FFFFFF"/>
-                <w:sz w:val="16"/>
+                <w:sz w:val="18"/>
               </w:rPr>
               <w:t>เงื่อนไข</w:t>
             </w:r>
@@ -1449,27 +1366,33 @@
         </w:tc>
       </w:tr>
       <w:tr>
+        <w:trPr>
+          <w:cantSplit/>
+        </w:trPr>
         <w:tc>
           <w:tcPr>
-            <w:tcW w:type="dxa" w:w="1728"/>
-            <w:vAlign w:val="center"/>
-            <w:shd w:fill="FFFFFF"/>
+            <w:tcW w:type="dxa" w:w="3346"/>
+            <w:tcBorders>
+              <w:top w:val="single" w:sz="4" w:color="D9D9D9"/>
+              <w:left w:val="single" w:sz="4" w:color="D9D9D9"/>
+              <w:bottom w:val="single" w:sz="4" w:color="D9D9D9"/>
+              <w:right w:val="single" w:sz="4" w:color="D9D9D9"/>
+            </w:tcBorders>
             <w:tcMar>
-              <w:top w:w="75" w:type="dxa"/>
-              <w:start w:w="90" w:type="dxa"/>
-              <w:bottom w:w="75" w:type="dxa"/>
-              <w:end w:w="90" w:type="dxa"/>
+              <w:top w:w="85" w:type="dxa"/>
+              <w:left w:w="85" w:type="dxa"/>
+              <w:bottom w:w="85" w:type="dxa"/>
+              <w:right w:w="85" w:type="dxa"/>
             </w:tcMar>
           </w:tcPr>
           <w:p>
             <w:pPr>
-              <w:spacing w:after="0"/>
+              <w:spacing w:after="60"/>
             </w:pPr>
             <w:r>
               <w:rPr>
-                <w:rFonts w:ascii="Tahoma" w:hAnsi="Tahoma" w:eastAsia="Tahoma"/>
-                <w:color w:val="1F4E79"/>
-                <w:sz w:val="16"/>
+                <w:b w:val="0"/>
+                <w:sz w:val="18"/>
               </w:rPr>
               <w:t>401</w:t>
             </w:r>
@@ -1477,25 +1400,28 @@
         </w:tc>
         <w:tc>
           <w:tcPr>
-            <w:tcW w:type="dxa" w:w="1656"/>
-            <w:vAlign w:val="center"/>
-            <w:shd w:fill="FFFFFF"/>
+            <w:tcW w:type="dxa" w:w="3346"/>
+            <w:tcBorders>
+              <w:top w:val="single" w:sz="4" w:color="D9D9D9"/>
+              <w:left w:val="single" w:sz="4" w:color="D9D9D9"/>
+              <w:bottom w:val="single" w:sz="4" w:color="D9D9D9"/>
+              <w:right w:val="single" w:sz="4" w:color="D9D9D9"/>
+            </w:tcBorders>
             <w:tcMar>
-              <w:top w:w="75" w:type="dxa"/>
-              <w:start w:w="90" w:type="dxa"/>
-              <w:bottom w:w="75" w:type="dxa"/>
-              <w:end w:w="90" w:type="dxa"/>
+              <w:top w:w="85" w:type="dxa"/>
+              <w:left w:w="85" w:type="dxa"/>
+              <w:bottom w:w="85" w:type="dxa"/>
+              <w:right w:w="85" w:type="dxa"/>
             </w:tcMar>
           </w:tcPr>
           <w:p>
             <w:pPr>
-              <w:spacing w:after="0"/>
+              <w:spacing w:after="60"/>
             </w:pPr>
             <w:r>
               <w:rPr>
-                <w:rFonts w:ascii="Tahoma" w:hAnsi="Tahoma" w:eastAsia="Tahoma"/>
-                <w:color w:val="1F4E79"/>
-                <w:sz w:val="16"/>
+                <w:b w:val="0"/>
+                <w:sz w:val="18"/>
               </w:rPr>
               <w:t>AUTH_REQUIRED</w:t>
             </w:r>
@@ -1503,24 +1429,28 @@
         </w:tc>
         <w:tc>
           <w:tcPr>
-            <w:tcW w:type="dxa" w:w="6480"/>
-            <w:vAlign w:val="center"/>
-            <w:shd w:fill="FFFFFF"/>
+            <w:tcW w:type="dxa" w:w="3346"/>
+            <w:tcBorders>
+              <w:top w:val="single" w:sz="4" w:color="D9D9D9"/>
+              <w:left w:val="single" w:sz="4" w:color="D9D9D9"/>
+              <w:bottom w:val="single" w:sz="4" w:color="D9D9D9"/>
+              <w:right w:val="single" w:sz="4" w:color="D9D9D9"/>
+            </w:tcBorders>
             <w:tcMar>
-              <w:top w:w="75" w:type="dxa"/>
-              <w:start w:w="90" w:type="dxa"/>
-              <w:bottom w:w="75" w:type="dxa"/>
-              <w:end w:w="90" w:type="dxa"/>
+              <w:top w:w="85" w:type="dxa"/>
+              <w:left w:w="85" w:type="dxa"/>
+              <w:bottom w:w="85" w:type="dxa"/>
+              <w:right w:w="85" w:type="dxa"/>
             </w:tcMar>
           </w:tcPr>
           <w:p>
             <w:pPr>
-              <w:spacing w:after="0"/>
+              <w:spacing w:after="60"/>
             </w:pPr>
             <w:r>
               <w:rPr>
-                <w:rFonts w:ascii="Tahoma" w:hAnsi="Tahoma" w:eastAsia="Tahoma"/>
-                <w:sz w:val="16"/>
+                <w:b w:val="0"/>
+                <w:sz w:val="18"/>
               </w:rPr>
               <w:t>ไม่มี token, token ไม่ถูกต้อง หรือหมดอายุ</w:t>
             </w:r>
@@ -1528,27 +1458,33 @@
         </w:tc>
       </w:tr>
       <w:tr>
+        <w:trPr>
+          <w:cantSplit/>
+        </w:trPr>
         <w:tc>
           <w:tcPr>
-            <w:tcW w:type="dxa" w:w="1728"/>
-            <w:vAlign w:val="center"/>
-            <w:shd w:fill="F3F6FA"/>
+            <w:tcW w:type="dxa" w:w="3346"/>
+            <w:tcBorders>
+              <w:top w:val="single" w:sz="4" w:color="D9D9D9"/>
+              <w:left w:val="single" w:sz="4" w:color="D9D9D9"/>
+              <w:bottom w:val="single" w:sz="4" w:color="D9D9D9"/>
+              <w:right w:val="single" w:sz="4" w:color="D9D9D9"/>
+            </w:tcBorders>
             <w:tcMar>
-              <w:top w:w="75" w:type="dxa"/>
-              <w:start w:w="90" w:type="dxa"/>
-              <w:bottom w:w="75" w:type="dxa"/>
-              <w:end w:w="90" w:type="dxa"/>
+              <w:top w:w="85" w:type="dxa"/>
+              <w:left w:w="85" w:type="dxa"/>
+              <w:bottom w:w="85" w:type="dxa"/>
+              <w:right w:w="85" w:type="dxa"/>
             </w:tcMar>
           </w:tcPr>
           <w:p>
             <w:pPr>
-              <w:spacing w:after="0"/>
+              <w:spacing w:after="60"/>
             </w:pPr>
             <w:r>
               <w:rPr>
-                <w:rFonts w:ascii="Tahoma" w:hAnsi="Tahoma" w:eastAsia="Tahoma"/>
-                <w:color w:val="1F4E79"/>
-                <w:sz w:val="16"/>
+                <w:b w:val="0"/>
+                <w:sz w:val="18"/>
               </w:rPr>
               <w:t>404</w:t>
             </w:r>
@@ -1556,25 +1492,28 @@
         </w:tc>
         <w:tc>
           <w:tcPr>
-            <w:tcW w:type="dxa" w:w="1656"/>
-            <w:vAlign w:val="center"/>
-            <w:shd w:fill="F3F6FA"/>
+            <w:tcW w:type="dxa" w:w="3346"/>
+            <w:tcBorders>
+              <w:top w:val="single" w:sz="4" w:color="D9D9D9"/>
+              <w:left w:val="single" w:sz="4" w:color="D9D9D9"/>
+              <w:bottom w:val="single" w:sz="4" w:color="D9D9D9"/>
+              <w:right w:val="single" w:sz="4" w:color="D9D9D9"/>
+            </w:tcBorders>
             <w:tcMar>
-              <w:top w:w="75" w:type="dxa"/>
-              <w:start w:w="90" w:type="dxa"/>
-              <w:bottom w:w="75" w:type="dxa"/>
-              <w:end w:w="90" w:type="dxa"/>
+              <w:top w:w="85" w:type="dxa"/>
+              <w:left w:w="85" w:type="dxa"/>
+              <w:bottom w:w="85" w:type="dxa"/>
+              <w:right w:w="85" w:type="dxa"/>
             </w:tcMar>
           </w:tcPr>
           <w:p>
             <w:pPr>
-              <w:spacing w:after="0"/>
+              <w:spacing w:after="60"/>
             </w:pPr>
             <w:r>
               <w:rPr>
-                <w:rFonts w:ascii="Tahoma" w:hAnsi="Tahoma" w:eastAsia="Tahoma"/>
-                <w:color w:val="1F4E79"/>
-                <w:sz w:val="16"/>
+                <w:b w:val="0"/>
+                <w:sz w:val="18"/>
               </w:rPr>
               <w:t>COURSE_NOT_FOUND</w:t>
             </w:r>
@@ -1582,67 +1521,62 @@
         </w:tc>
         <w:tc>
           <w:tcPr>
-            <w:tcW w:type="dxa" w:w="6480"/>
-            <w:vAlign w:val="center"/>
-            <w:shd w:fill="F3F6FA"/>
+            <w:tcW w:type="dxa" w:w="3346"/>
+            <w:tcBorders>
+              <w:top w:val="single" w:sz="4" w:color="D9D9D9"/>
+              <w:left w:val="single" w:sz="4" w:color="D9D9D9"/>
+              <w:bottom w:val="single" w:sz="4" w:color="D9D9D9"/>
+              <w:right w:val="single" w:sz="4" w:color="D9D9D9"/>
+            </w:tcBorders>
             <w:tcMar>
-              <w:top w:w="75" w:type="dxa"/>
-              <w:start w:w="90" w:type="dxa"/>
-              <w:bottom w:w="75" w:type="dxa"/>
-              <w:end w:w="90" w:type="dxa"/>
+              <w:top w:w="85" w:type="dxa"/>
+              <w:left w:w="85" w:type="dxa"/>
+              <w:bottom w:w="85" w:type="dxa"/>
+              <w:right w:w="85" w:type="dxa"/>
             </w:tcMar>
           </w:tcPr>
           <w:p>
             <w:pPr>
-              <w:spacing w:after="0"/>
+              <w:spacing w:after="60"/>
             </w:pPr>
             <w:r>
               <w:rPr>
-                <w:rFonts w:ascii="Tahoma" w:hAnsi="Tahoma" w:eastAsia="Tahoma"/>
-                <w:sz w:val="16"/>
+                <w:b w:val="0"/>
+                <w:sz w:val="18"/>
               </w:rPr>
-              <w:t xml:space="preserve">ไม่พบ </w:t>
-            </w:r>
-            <w:r>
-              <w:rPr>
-                <w:rFonts w:ascii="Tahoma" w:hAnsi="Tahoma" w:eastAsia="Tahoma"/>
-                <w:color w:val="1F4E79"/>
-                <w:sz w:val="16"/>
-              </w:rPr>
-              <w:t>course_id</w:t>
-            </w:r>
-            <w:r>
-              <w:rPr>
-                <w:rFonts w:ascii="Tahoma" w:hAnsi="Tahoma" w:eastAsia="Tahoma"/>
-                <w:sz w:val="16"/>
-              </w:rPr>
-              <w:t xml:space="preserve"> ในระบบ</w:t>
+              <w:t>ไม่พบ course_id หรือรหัสวิชาอยู่นอกขอบเขต CS</w:t>
             </w:r>
           </w:p>
         </w:tc>
       </w:tr>
       <w:tr>
+        <w:trPr>
+          <w:cantSplit/>
+        </w:trPr>
         <w:tc>
           <w:tcPr>
-            <w:tcW w:type="dxa" w:w="1728"/>
-            <w:vAlign w:val="center"/>
-            <w:shd w:fill="FFFFFF"/>
+            <w:tcW w:type="dxa" w:w="3346"/>
+            <w:tcBorders>
+              <w:top w:val="single" w:sz="4" w:color="D9D9D9"/>
+              <w:left w:val="single" w:sz="4" w:color="D9D9D9"/>
+              <w:bottom w:val="single" w:sz="4" w:color="D9D9D9"/>
+              <w:right w:val="single" w:sz="4" w:color="D9D9D9"/>
+            </w:tcBorders>
             <w:tcMar>
-              <w:top w:w="75" w:type="dxa"/>
-              <w:start w:w="90" w:type="dxa"/>
-              <w:bottom w:w="75" w:type="dxa"/>
-              <w:end w:w="90" w:type="dxa"/>
+              <w:top w:w="85" w:type="dxa"/>
+              <w:left w:w="85" w:type="dxa"/>
+              <w:bottom w:w="85" w:type="dxa"/>
+              <w:right w:w="85" w:type="dxa"/>
             </w:tcMar>
           </w:tcPr>
           <w:p>
             <w:pPr>
-              <w:spacing w:after="0"/>
+              <w:spacing w:after="60"/>
             </w:pPr>
             <w:r>
               <w:rPr>
-                <w:rFonts w:ascii="Tahoma" w:hAnsi="Tahoma" w:eastAsia="Tahoma"/>
-                <w:color w:val="1F4E79"/>
-                <w:sz w:val="16"/>
+                <w:b w:val="0"/>
+                <w:sz w:val="18"/>
               </w:rPr>
               <w:t>422</w:t>
             </w:r>
@@ -1650,25 +1584,28 @@
         </w:tc>
         <w:tc>
           <w:tcPr>
-            <w:tcW w:type="dxa" w:w="1656"/>
-            <w:vAlign w:val="center"/>
-            <w:shd w:fill="FFFFFF"/>
+            <w:tcW w:type="dxa" w:w="3346"/>
+            <w:tcBorders>
+              <w:top w:val="single" w:sz="4" w:color="D9D9D9"/>
+              <w:left w:val="single" w:sz="4" w:color="D9D9D9"/>
+              <w:bottom w:val="single" w:sz="4" w:color="D9D9D9"/>
+              <w:right w:val="single" w:sz="4" w:color="D9D9D9"/>
+            </w:tcBorders>
             <w:tcMar>
-              <w:top w:w="75" w:type="dxa"/>
-              <w:start w:w="90" w:type="dxa"/>
-              <w:bottom w:w="75" w:type="dxa"/>
-              <w:end w:w="90" w:type="dxa"/>
+              <w:top w:w="85" w:type="dxa"/>
+              <w:left w:w="85" w:type="dxa"/>
+              <w:bottom w:w="85" w:type="dxa"/>
+              <w:right w:w="85" w:type="dxa"/>
             </w:tcMar>
           </w:tcPr>
           <w:p>
             <w:pPr>
-              <w:spacing w:after="0"/>
+              <w:spacing w:after="60"/>
             </w:pPr>
             <w:r>
               <w:rPr>
-                <w:rFonts w:ascii="Tahoma" w:hAnsi="Tahoma" w:eastAsia="Tahoma"/>
-                <w:color w:val="1F4E79"/>
-                <w:sz w:val="16"/>
+                <w:b w:val="0"/>
+                <w:sz w:val="18"/>
               </w:rPr>
               <w:t>INVALID_PARAMETERS</w:t>
             </w:r>
@@ -1676,24 +1613,28 @@
         </w:tc>
         <w:tc>
           <w:tcPr>
-            <w:tcW w:type="dxa" w:w="6480"/>
-            <w:vAlign w:val="center"/>
-            <w:shd w:fill="FFFFFF"/>
+            <w:tcW w:type="dxa" w:w="3346"/>
+            <w:tcBorders>
+              <w:top w:val="single" w:sz="4" w:color="D9D9D9"/>
+              <w:left w:val="single" w:sz="4" w:color="D9D9D9"/>
+              <w:bottom w:val="single" w:sz="4" w:color="D9D9D9"/>
+              <w:right w:val="single" w:sz="4" w:color="D9D9D9"/>
+            </w:tcBorders>
             <w:tcMar>
-              <w:top w:w="75" w:type="dxa"/>
-              <w:start w:w="90" w:type="dxa"/>
-              <w:bottom w:w="75" w:type="dxa"/>
-              <w:end w:w="90" w:type="dxa"/>
+              <w:top w:w="85" w:type="dxa"/>
+              <w:left w:w="85" w:type="dxa"/>
+              <w:bottom w:w="85" w:type="dxa"/>
+              <w:right w:w="85" w:type="dxa"/>
             </w:tcMar>
           </w:tcPr>
           <w:p>
             <w:pPr>
-              <w:spacing w:after="0"/>
+              <w:spacing w:after="60"/>
             </w:pPr>
             <w:r>
               <w:rPr>
-                <w:rFonts w:ascii="Tahoma" w:hAnsi="Tahoma" w:eastAsia="Tahoma"/>
-                <w:sz w:val="16"/>
+                <w:b w:val="0"/>
+                <w:sz w:val="18"/>
               </w:rPr>
               <w:t>ฟิลด์บังคับหายไป รูปแบบข้อมูลผิด หรือค่าอยู่นอกกติกา</w:t>
             </w:r>
@@ -1701,27 +1642,33 @@
         </w:tc>
       </w:tr>
       <w:tr>
+        <w:trPr>
+          <w:cantSplit/>
+        </w:trPr>
         <w:tc>
           <w:tcPr>
-            <w:tcW w:type="dxa" w:w="1728"/>
-            <w:vAlign w:val="center"/>
-            <w:shd w:fill="F3F6FA"/>
+            <w:tcW w:type="dxa" w:w="3346"/>
+            <w:tcBorders>
+              <w:top w:val="single" w:sz="4" w:color="D9D9D9"/>
+              <w:left w:val="single" w:sz="4" w:color="D9D9D9"/>
+              <w:bottom w:val="single" w:sz="4" w:color="D9D9D9"/>
+              <w:right w:val="single" w:sz="4" w:color="D9D9D9"/>
+            </w:tcBorders>
             <w:tcMar>
-              <w:top w:w="75" w:type="dxa"/>
-              <w:start w:w="90" w:type="dxa"/>
-              <w:bottom w:w="75" w:type="dxa"/>
-              <w:end w:w="90" w:type="dxa"/>
+              <w:top w:w="85" w:type="dxa"/>
+              <w:left w:w="85" w:type="dxa"/>
+              <w:bottom w:w="85" w:type="dxa"/>
+              <w:right w:w="85" w:type="dxa"/>
             </w:tcMar>
           </w:tcPr>
           <w:p>
             <w:pPr>
-              <w:spacing w:after="0"/>
+              <w:spacing w:after="60"/>
             </w:pPr>
             <w:r>
               <w:rPr>
-                <w:rFonts w:ascii="Tahoma" w:hAnsi="Tahoma" w:eastAsia="Tahoma"/>
-                <w:color w:val="1F4E79"/>
-                <w:sz w:val="16"/>
+                <w:b w:val="0"/>
+                <w:sz w:val="18"/>
               </w:rPr>
               <w:t>500</w:t>
             </w:r>
@@ -1729,25 +1676,28 @@
         </w:tc>
         <w:tc>
           <w:tcPr>
-            <w:tcW w:type="dxa" w:w="1656"/>
-            <w:vAlign w:val="center"/>
-            <w:shd w:fill="F3F6FA"/>
+            <w:tcW w:type="dxa" w:w="3346"/>
+            <w:tcBorders>
+              <w:top w:val="single" w:sz="4" w:color="D9D9D9"/>
+              <w:left w:val="single" w:sz="4" w:color="D9D9D9"/>
+              <w:bottom w:val="single" w:sz="4" w:color="D9D9D9"/>
+              <w:right w:val="single" w:sz="4" w:color="D9D9D9"/>
+            </w:tcBorders>
             <w:tcMar>
-              <w:top w:w="75" w:type="dxa"/>
-              <w:start w:w="90" w:type="dxa"/>
-              <w:bottom w:w="75" w:type="dxa"/>
-              <w:end w:w="90" w:type="dxa"/>
+              <w:top w:w="85" w:type="dxa"/>
+              <w:left w:w="85" w:type="dxa"/>
+              <w:bottom w:w="85" w:type="dxa"/>
+              <w:right w:w="85" w:type="dxa"/>
             </w:tcMar>
           </w:tcPr>
           <w:p>
             <w:pPr>
-              <w:spacing w:after="0"/>
+              <w:spacing w:after="60"/>
             </w:pPr>
             <w:r>
               <w:rPr>
-                <w:rFonts w:ascii="Tahoma" w:hAnsi="Tahoma" w:eastAsia="Tahoma"/>
-                <w:color w:val="1F4E79"/>
-                <w:sz w:val="16"/>
+                <w:b w:val="0"/>
+                <w:sz w:val="18"/>
               </w:rPr>
               <w:t>INTERNAL_ERROR</w:t>
             </w:r>
@@ -1755,24 +1705,28 @@
         </w:tc>
         <w:tc>
           <w:tcPr>
-            <w:tcW w:type="dxa" w:w="6480"/>
-            <w:vAlign w:val="center"/>
-            <w:shd w:fill="F3F6FA"/>
+            <w:tcW w:type="dxa" w:w="3346"/>
+            <w:tcBorders>
+              <w:top w:val="single" w:sz="4" w:color="D9D9D9"/>
+              <w:left w:val="single" w:sz="4" w:color="D9D9D9"/>
+              <w:bottom w:val="single" w:sz="4" w:color="D9D9D9"/>
+              <w:right w:val="single" w:sz="4" w:color="D9D9D9"/>
+            </w:tcBorders>
             <w:tcMar>
-              <w:top w:w="75" w:type="dxa"/>
-              <w:start w:w="90" w:type="dxa"/>
-              <w:bottom w:w="75" w:type="dxa"/>
-              <w:end w:w="90" w:type="dxa"/>
+              <w:top w:w="85" w:type="dxa"/>
+              <w:left w:w="85" w:type="dxa"/>
+              <w:bottom w:w="85" w:type="dxa"/>
+              <w:right w:w="85" w:type="dxa"/>
             </w:tcMar>
           </w:tcPr>
           <w:p>
             <w:pPr>
-              <w:spacing w:after="0"/>
+              <w:spacing w:after="60"/>
             </w:pPr>
             <w:r>
               <w:rPr>
-                <w:rFonts w:ascii="Tahoma" w:hAnsi="Tahoma" w:eastAsia="Tahoma"/>
-                <w:sz w:val="16"/>
+                <w:b w:val="0"/>
+                <w:sz w:val="18"/>
               </w:rPr>
               <w:t>เกิดข้อผิดพลาดระหว่างบันทึก ระบบต้องไม่ตอบว่าสำเร็จ</w:t>
             </w:r>
@@ -1780,11 +1734,7 @@
         </w:tc>
       </w:tr>
     </w:tbl>
-    <w:p>
-      <w:pPr>
-        <w:spacing w:after="20"/>
-      </w:pPr>
-    </w:p>
+    <w:p/>
     <w:p>
       <w:r>
         <w:t>กรณีบันทึกล้มเหลวต้อง rollback transaction เพื่อไม่ให้เกิดรายการบางส่วน รายละเอียดการควบคุม transaction และ DAO เป็นขอบเขตของ Task56/57</w:t>
@@ -1795,44 +1745,50 @@
         <w:pStyle w:val="Heading1"/>
       </w:pPr>
       <w:r>
-        <w:t>DTO ที่เสนอ</w:t>
+        <w:t>DTO ที่ใช้งาน</w:t>
       </w:r>
     </w:p>
     <w:tbl>
       <w:tblPr>
         <w:tblW w:type="auto" w:w="0"/>
-        <w:jc w:val="center"/>
-        <w:tblLayout w:type="fixed"/>
+        <w:tblLayout w:type="autofit"/>
         <w:tblLook w:firstColumn="1" w:firstRow="1" w:lastColumn="0" w:lastRow="0" w:noHBand="0" w:noVBand="1" w:val="04A0"/>
       </w:tblPr>
       <w:tblGrid>
-        <w:gridCol w:w="3389"/>
-        <w:gridCol w:w="3389"/>
-        <w:gridCol w:w="3389"/>
+        <w:gridCol w:w="3346"/>
+        <w:gridCol w:w="3346"/>
+        <w:gridCol w:w="3346"/>
       </w:tblGrid>
       <w:tr>
+        <w:trPr>
+          <w:cantSplit/>
+          <w:tblHeader/>
+        </w:trPr>
         <w:tc>
           <w:tcPr>
-            <w:tcW w:type="dxa" w:w="1728"/>
-            <w:vAlign w:val="center"/>
-            <w:shd w:fill="1F4E78"/>
+            <w:tcW w:type="dxa" w:w="3346"/>
+            <w:tcBorders>
+              <w:top w:val="single" w:sz="4" w:color="D9D9D9"/>
+              <w:left w:val="single" w:sz="4" w:color="D9D9D9"/>
+              <w:bottom w:val="single" w:sz="4" w:color="D9D9D9"/>
+              <w:right w:val="single" w:sz="4" w:color="D9D9D9"/>
+            </w:tcBorders>
             <w:tcMar>
-              <w:top w:w="75" w:type="dxa"/>
-              <w:start w:w="90" w:type="dxa"/>
-              <w:bottom w:w="75" w:type="dxa"/>
-              <w:end w:w="90" w:type="dxa"/>
+              <w:top w:w="85" w:type="dxa"/>
+              <w:left w:w="85" w:type="dxa"/>
+              <w:bottom w:w="85" w:type="dxa"/>
+              <w:right w:w="85" w:type="dxa"/>
             </w:tcMar>
+            <w:shd w:fill="E8EEF4"/>
           </w:tcPr>
           <w:p>
             <w:pPr>
-              <w:spacing w:after="0"/>
+              <w:spacing w:after="60"/>
             </w:pPr>
             <w:r>
               <w:rPr>
-                <w:rFonts w:ascii="Tahoma" w:hAnsi="Tahoma" w:eastAsia="Tahoma"/>
                 <w:b/>
-                <w:color w:val="FFFFFF"/>
-                <w:sz w:val="16"/>
+                <w:sz w:val="18"/>
               </w:rPr>
               <w:t>DTO</w:t>
             </w:r>
@@ -1840,26 +1796,29 @@
         </w:tc>
         <w:tc>
           <w:tcPr>
-            <w:tcW w:type="dxa" w:w="1656"/>
-            <w:vAlign w:val="center"/>
-            <w:shd w:fill="1F4E78"/>
+            <w:tcW w:type="dxa" w:w="3346"/>
+            <w:tcBorders>
+              <w:top w:val="single" w:sz="4" w:color="D9D9D9"/>
+              <w:left w:val="single" w:sz="4" w:color="D9D9D9"/>
+              <w:bottom w:val="single" w:sz="4" w:color="D9D9D9"/>
+              <w:right w:val="single" w:sz="4" w:color="D9D9D9"/>
+            </w:tcBorders>
             <w:tcMar>
-              <w:top w:w="75" w:type="dxa"/>
-              <w:start w:w="90" w:type="dxa"/>
-              <w:bottom w:w="75" w:type="dxa"/>
-              <w:end w:w="90" w:type="dxa"/>
+              <w:top w:w="85" w:type="dxa"/>
+              <w:left w:w="85" w:type="dxa"/>
+              <w:bottom w:w="85" w:type="dxa"/>
+              <w:right w:w="85" w:type="dxa"/>
             </w:tcMar>
+            <w:shd w:fill="E8EEF4"/>
           </w:tcPr>
           <w:p>
             <w:pPr>
-              <w:spacing w:after="0"/>
+              <w:spacing w:after="60"/>
             </w:pPr>
             <w:r>
               <w:rPr>
-                <w:rFonts w:ascii="Tahoma" w:hAnsi="Tahoma" w:eastAsia="Tahoma"/>
                 <w:b/>
-                <w:color w:val="FFFFFF"/>
-                <w:sz w:val="16"/>
+                <w:sz w:val="18"/>
               </w:rPr>
               <w:t>หน้าที่</w:t>
             </w:r>
@@ -1867,26 +1826,29 @@
         </w:tc>
         <w:tc>
           <w:tcPr>
-            <w:tcW w:type="dxa" w:w="6480"/>
-            <w:vAlign w:val="center"/>
-            <w:shd w:fill="1F4E78"/>
+            <w:tcW w:type="dxa" w:w="3346"/>
+            <w:tcBorders>
+              <w:top w:val="single" w:sz="4" w:color="D9D9D9"/>
+              <w:left w:val="single" w:sz="4" w:color="D9D9D9"/>
+              <w:bottom w:val="single" w:sz="4" w:color="D9D9D9"/>
+              <w:right w:val="single" w:sz="4" w:color="D9D9D9"/>
+            </w:tcBorders>
             <w:tcMar>
-              <w:top w:w="75" w:type="dxa"/>
-              <w:start w:w="90" w:type="dxa"/>
-              <w:bottom w:w="75" w:type="dxa"/>
-              <w:end w:w="90" w:type="dxa"/>
+              <w:top w:w="85" w:type="dxa"/>
+              <w:left w:w="85" w:type="dxa"/>
+              <w:bottom w:w="85" w:type="dxa"/>
+              <w:right w:w="85" w:type="dxa"/>
             </w:tcMar>
+            <w:shd w:fill="E8EEF4"/>
           </w:tcPr>
           <w:p>
             <w:pPr>
-              <w:spacing w:after="0"/>
+              <w:spacing w:after="60"/>
             </w:pPr>
             <w:r>
               <w:rPr>
-                <w:rFonts w:ascii="Tahoma" w:hAnsi="Tahoma" w:eastAsia="Tahoma"/>
                 <w:b/>
-                <w:color w:val="FFFFFF"/>
-                <w:sz w:val="16"/>
+                <w:sz w:val="18"/>
               </w:rPr>
               <w:t>ข้อมูลหลัก</w:t>
             </w:r>
@@ -1894,27 +1856,33 @@
         </w:tc>
       </w:tr>
       <w:tr>
+        <w:trPr>
+          <w:cantSplit/>
+        </w:trPr>
         <w:tc>
           <w:tcPr>
-            <w:tcW w:type="dxa" w:w="1728"/>
-            <w:vAlign w:val="center"/>
-            <w:shd w:fill="FFFFFF"/>
+            <w:tcW w:type="dxa" w:w="3346"/>
+            <w:tcBorders>
+              <w:top w:val="single" w:sz="4" w:color="D9D9D9"/>
+              <w:left w:val="single" w:sz="4" w:color="D9D9D9"/>
+              <w:bottom w:val="single" w:sz="4" w:color="D9D9D9"/>
+              <w:right w:val="single" w:sz="4" w:color="D9D9D9"/>
+            </w:tcBorders>
             <w:tcMar>
-              <w:top w:w="75" w:type="dxa"/>
-              <w:start w:w="90" w:type="dxa"/>
-              <w:bottom w:w="75" w:type="dxa"/>
-              <w:end w:w="90" w:type="dxa"/>
+              <w:top w:w="85" w:type="dxa"/>
+              <w:left w:w="85" w:type="dxa"/>
+              <w:bottom w:w="85" w:type="dxa"/>
+              <w:right w:w="85" w:type="dxa"/>
             </w:tcMar>
           </w:tcPr>
           <w:p>
             <w:pPr>
-              <w:spacing w:after="0"/>
+              <w:spacing w:after="60"/>
             </w:pPr>
             <w:r>
               <w:rPr>
-                <w:rFonts w:ascii="Tahoma" w:hAnsi="Tahoma" w:eastAsia="Tahoma"/>
-                <w:color w:val="1F4E79"/>
-                <w:sz w:val="16"/>
+                <w:b w:val="0"/>
+                <w:sz w:val="18"/>
               </w:rPr>
               <w:t>GuidePublishRequestDTO</w:t>
             </w:r>
@@ -1922,24 +1890,28 @@
         </w:tc>
         <w:tc>
           <w:tcPr>
-            <w:tcW w:type="dxa" w:w="1656"/>
-            <w:vAlign w:val="center"/>
-            <w:shd w:fill="FFFFFF"/>
+            <w:tcW w:type="dxa" w:w="3346"/>
+            <w:tcBorders>
+              <w:top w:val="single" w:sz="4" w:color="D9D9D9"/>
+              <w:left w:val="single" w:sz="4" w:color="D9D9D9"/>
+              <w:bottom w:val="single" w:sz="4" w:color="D9D9D9"/>
+              <w:right w:val="single" w:sz="4" w:color="D9D9D9"/>
+            </w:tcBorders>
             <w:tcMar>
-              <w:top w:w="75" w:type="dxa"/>
-              <w:start w:w="90" w:type="dxa"/>
-              <w:bottom w:w="75" w:type="dxa"/>
-              <w:end w:w="90" w:type="dxa"/>
+              <w:top w:w="85" w:type="dxa"/>
+              <w:left w:w="85" w:type="dxa"/>
+              <w:bottom w:w="85" w:type="dxa"/>
+              <w:right w:w="85" w:type="dxa"/>
             </w:tcMar>
           </w:tcPr>
           <w:p>
             <w:pPr>
-              <w:spacing w:after="0"/>
+              <w:spacing w:after="60"/>
             </w:pPr>
             <w:r>
               <w:rPr>
-                <w:rFonts w:ascii="Tahoma" w:hAnsi="Tahoma" w:eastAsia="Tahoma"/>
-                <w:sz w:val="16"/>
+                <w:b w:val="0"/>
+                <w:sz w:val="18"/>
               </w:rPr>
               <w:t>ตรวจข้อมูลจากผู้เรียก</w:t>
             </w:r>
@@ -1947,60 +1919,62 @@
         </w:tc>
         <w:tc>
           <w:tcPr>
-            <w:tcW w:type="dxa" w:w="6480"/>
-            <w:vAlign w:val="center"/>
-            <w:shd w:fill="FFFFFF"/>
+            <w:tcW w:type="dxa" w:w="3346"/>
+            <w:tcBorders>
+              <w:top w:val="single" w:sz="4" w:color="D9D9D9"/>
+              <w:left w:val="single" w:sz="4" w:color="D9D9D9"/>
+              <w:bottom w:val="single" w:sz="4" w:color="D9D9D9"/>
+              <w:right w:val="single" w:sz="4" w:color="D9D9D9"/>
+            </w:tcBorders>
             <w:tcMar>
-              <w:top w:w="75" w:type="dxa"/>
-              <w:start w:w="90" w:type="dxa"/>
-              <w:bottom w:w="75" w:type="dxa"/>
-              <w:end w:w="90" w:type="dxa"/>
+              <w:top w:w="85" w:type="dxa"/>
+              <w:left w:w="85" w:type="dxa"/>
+              <w:bottom w:w="85" w:type="dxa"/>
+              <w:right w:w="85" w:type="dxa"/>
             </w:tcMar>
           </w:tcPr>
           <w:p>
             <w:pPr>
-              <w:spacing w:after="0"/>
+              <w:spacing w:after="60"/>
             </w:pPr>
             <w:r>
               <w:rPr>
-                <w:rFonts w:ascii="Tahoma" w:hAnsi="Tahoma" w:eastAsia="Tahoma"/>
-                <w:sz w:val="16"/>
+                <w:b w:val="0"/>
+                <w:sz w:val="18"/>
               </w:rPr>
-              <w:t xml:space="preserve">ฟิลด์ Request ตามตารางด้านบน ไม่มี </w:t>
-            </w:r>
-            <w:r>
-              <w:rPr>
-                <w:rFonts w:ascii="Tahoma" w:hAnsi="Tahoma" w:eastAsia="Tahoma"/>
-                <w:color w:val="1F4E79"/>
-                <w:sz w:val="16"/>
-              </w:rPr>
-              <w:t>publisher_id</w:t>
+              <w:t>ฟิลด์ Request ตามตารางด้านบน ไม่มี publisher_id</w:t>
             </w:r>
           </w:p>
         </w:tc>
       </w:tr>
       <w:tr>
+        <w:trPr>
+          <w:cantSplit/>
+        </w:trPr>
         <w:tc>
           <w:tcPr>
-            <w:tcW w:type="dxa" w:w="1728"/>
-            <w:vAlign w:val="center"/>
-            <w:shd w:fill="F3F6FA"/>
+            <w:tcW w:type="dxa" w:w="3346"/>
+            <w:tcBorders>
+              <w:top w:val="single" w:sz="4" w:color="D9D9D9"/>
+              <w:left w:val="single" w:sz="4" w:color="D9D9D9"/>
+              <w:bottom w:val="single" w:sz="4" w:color="D9D9D9"/>
+              <w:right w:val="single" w:sz="4" w:color="D9D9D9"/>
+            </w:tcBorders>
             <w:tcMar>
-              <w:top w:w="75" w:type="dxa"/>
-              <w:start w:w="90" w:type="dxa"/>
-              <w:bottom w:w="75" w:type="dxa"/>
-              <w:end w:w="90" w:type="dxa"/>
+              <w:top w:w="85" w:type="dxa"/>
+              <w:left w:w="85" w:type="dxa"/>
+              <w:bottom w:w="85" w:type="dxa"/>
+              <w:right w:w="85" w:type="dxa"/>
             </w:tcMar>
           </w:tcPr>
           <w:p>
             <w:pPr>
-              <w:spacing w:after="0"/>
+              <w:spacing w:after="60"/>
             </w:pPr>
             <w:r>
               <w:rPr>
-                <w:rFonts w:ascii="Tahoma" w:hAnsi="Tahoma" w:eastAsia="Tahoma"/>
-                <w:color w:val="1F4E79"/>
-                <w:sz w:val="16"/>
+                <w:b w:val="0"/>
+                <w:sz w:val="18"/>
               </w:rPr>
               <w:t>GuideDetailResponseDTO</w:t>
             </w:r>
@@ -2008,24 +1982,28 @@
         </w:tc>
         <w:tc>
           <w:tcPr>
-            <w:tcW w:type="dxa" w:w="1656"/>
-            <w:vAlign w:val="center"/>
-            <w:shd w:fill="F3F6FA"/>
+            <w:tcW w:type="dxa" w:w="3346"/>
+            <w:tcBorders>
+              <w:top w:val="single" w:sz="4" w:color="D9D9D9"/>
+              <w:left w:val="single" w:sz="4" w:color="D9D9D9"/>
+              <w:bottom w:val="single" w:sz="4" w:color="D9D9D9"/>
+              <w:right w:val="single" w:sz="4" w:color="D9D9D9"/>
+            </w:tcBorders>
             <w:tcMar>
-              <w:top w:w="75" w:type="dxa"/>
-              <w:start w:w="90" w:type="dxa"/>
-              <w:bottom w:w="75" w:type="dxa"/>
-              <w:end w:w="90" w:type="dxa"/>
+              <w:top w:w="85" w:type="dxa"/>
+              <w:left w:w="85" w:type="dxa"/>
+              <w:bottom w:w="85" w:type="dxa"/>
+              <w:right w:w="85" w:type="dxa"/>
             </w:tcMar>
           </w:tcPr>
           <w:p>
             <w:pPr>
-              <w:spacing w:after="0"/>
+              <w:spacing w:after="60"/>
             </w:pPr>
             <w:r>
               <w:rPr>
-                <w:rFonts w:ascii="Tahoma" w:hAnsi="Tahoma" w:eastAsia="Tahoma"/>
-                <w:sz w:val="16"/>
+                <w:b w:val="0"/>
+                <w:sz w:val="18"/>
               </w:rPr>
               <w:t>ส่งข้อมูลที่สร้างกลับไปให้หน้าเว็บ</w:t>
             </w:r>
@@ -2033,24 +2011,28 @@
         </w:tc>
         <w:tc>
           <w:tcPr>
-            <w:tcW w:type="dxa" w:w="6480"/>
-            <w:vAlign w:val="center"/>
-            <w:shd w:fill="F3F6FA"/>
+            <w:tcW w:type="dxa" w:w="3346"/>
+            <w:tcBorders>
+              <w:top w:val="single" w:sz="4" w:color="D9D9D9"/>
+              <w:left w:val="single" w:sz="4" w:color="D9D9D9"/>
+              <w:bottom w:val="single" w:sz="4" w:color="D9D9D9"/>
+              <w:right w:val="single" w:sz="4" w:color="D9D9D9"/>
+            </w:tcBorders>
             <w:tcMar>
-              <w:top w:w="75" w:type="dxa"/>
-              <w:start w:w="90" w:type="dxa"/>
-              <w:bottom w:w="75" w:type="dxa"/>
-              <w:end w:w="90" w:type="dxa"/>
+              <w:top w:w="85" w:type="dxa"/>
+              <w:left w:w="85" w:type="dxa"/>
+              <w:bottom w:w="85" w:type="dxa"/>
+              <w:right w:w="85" w:type="dxa"/>
             </w:tcMar>
           </w:tcPr>
           <w:p>
             <w:pPr>
-              <w:spacing w:after="0"/>
+              <w:spacing w:after="60"/>
             </w:pPr>
             <w:r>
               <w:rPr>
-                <w:rFonts w:ascii="Tahoma" w:hAnsi="Tahoma" w:eastAsia="Tahoma"/>
-                <w:sz w:val="16"/>
+                <w:b w:val="0"/>
+                <w:sz w:val="18"/>
               </w:rPr>
               <w:t>ใช้ DTO รายละเอียดเดิม เพื่อเปิดหน้ารายการที่เพิ่งเผยแพร่</w:t>
             </w:r>
@@ -2058,27 +2040,33 @@
         </w:tc>
       </w:tr>
       <w:tr>
+        <w:trPr>
+          <w:cantSplit/>
+        </w:trPr>
         <w:tc>
           <w:tcPr>
-            <w:tcW w:type="dxa" w:w="1728"/>
-            <w:vAlign w:val="center"/>
-            <w:shd w:fill="FFFFFF"/>
+            <w:tcW w:type="dxa" w:w="3346"/>
+            <w:tcBorders>
+              <w:top w:val="single" w:sz="4" w:color="D9D9D9"/>
+              <w:left w:val="single" w:sz="4" w:color="D9D9D9"/>
+              <w:bottom w:val="single" w:sz="4" w:color="D9D9D9"/>
+              <w:right w:val="single" w:sz="4" w:color="D9D9D9"/>
+            </w:tcBorders>
             <w:tcMar>
-              <w:top w:w="75" w:type="dxa"/>
-              <w:start w:w="90" w:type="dxa"/>
-              <w:bottom w:w="75" w:type="dxa"/>
-              <w:end w:w="90" w:type="dxa"/>
+              <w:top w:w="85" w:type="dxa"/>
+              <w:left w:w="85" w:type="dxa"/>
+              <w:bottom w:w="85" w:type="dxa"/>
+              <w:right w:w="85" w:type="dxa"/>
             </w:tcMar>
           </w:tcPr>
           <w:p>
             <w:pPr>
-              <w:spacing w:after="0"/>
+              <w:spacing w:after="60"/>
             </w:pPr>
             <w:r>
               <w:rPr>
-                <w:rFonts w:ascii="Tahoma" w:hAnsi="Tahoma" w:eastAsia="Tahoma"/>
-                <w:color w:val="1F4E79"/>
-                <w:sz w:val="16"/>
+                <w:b w:val="0"/>
+                <w:sz w:val="18"/>
               </w:rPr>
               <w:t>ErrorResponseDTO</w:t>
             </w:r>
@@ -2086,24 +2074,28 @@
         </w:tc>
         <w:tc>
           <w:tcPr>
-            <w:tcW w:type="dxa" w:w="1656"/>
-            <w:vAlign w:val="center"/>
-            <w:shd w:fill="FFFFFF"/>
+            <w:tcW w:type="dxa" w:w="3346"/>
+            <w:tcBorders>
+              <w:top w:val="single" w:sz="4" w:color="D9D9D9"/>
+              <w:left w:val="single" w:sz="4" w:color="D9D9D9"/>
+              <w:bottom w:val="single" w:sz="4" w:color="D9D9D9"/>
+              <w:right w:val="single" w:sz="4" w:color="D9D9D9"/>
+            </w:tcBorders>
             <w:tcMar>
-              <w:top w:w="75" w:type="dxa"/>
-              <w:start w:w="90" w:type="dxa"/>
-              <w:bottom w:w="75" w:type="dxa"/>
-              <w:end w:w="90" w:type="dxa"/>
+              <w:top w:w="85" w:type="dxa"/>
+              <w:left w:w="85" w:type="dxa"/>
+              <w:bottom w:w="85" w:type="dxa"/>
+              <w:right w:w="85" w:type="dxa"/>
             </w:tcMar>
           </w:tcPr>
           <w:p>
             <w:pPr>
-              <w:spacing w:after="0"/>
+              <w:spacing w:after="60"/>
             </w:pPr>
             <w:r>
               <w:rPr>
-                <w:rFonts w:ascii="Tahoma" w:hAnsi="Tahoma" w:eastAsia="Tahoma"/>
-                <w:sz w:val="16"/>
+                <w:b w:val="0"/>
+                <w:sz w:val="18"/>
               </w:rPr>
               <w:t>ส่งข้อผิดพลาดในรูปแบบเดียวกัน</w:t>
             </w:r>
@@ -2111,70 +2103,39 @@
         </w:tc>
         <w:tc>
           <w:tcPr>
-            <w:tcW w:type="dxa" w:w="6480"/>
-            <w:vAlign w:val="center"/>
-            <w:shd w:fill="FFFFFF"/>
+            <w:tcW w:type="dxa" w:w="3346"/>
+            <w:tcBorders>
+              <w:top w:val="single" w:sz="4" w:color="D9D9D9"/>
+              <w:left w:val="single" w:sz="4" w:color="D9D9D9"/>
+              <w:bottom w:val="single" w:sz="4" w:color="D9D9D9"/>
+              <w:right w:val="single" w:sz="4" w:color="D9D9D9"/>
+            </w:tcBorders>
             <w:tcMar>
-              <w:top w:w="75" w:type="dxa"/>
-              <w:start w:w="90" w:type="dxa"/>
-              <w:bottom w:w="75" w:type="dxa"/>
-              <w:end w:w="90" w:type="dxa"/>
+              <w:top w:w="85" w:type="dxa"/>
+              <w:left w:w="85" w:type="dxa"/>
+              <w:bottom w:w="85" w:type="dxa"/>
+              <w:right w:w="85" w:type="dxa"/>
             </w:tcMar>
           </w:tcPr>
           <w:p>
             <w:pPr>
-              <w:spacing w:after="0"/>
+              <w:spacing w:after="60"/>
             </w:pPr>
             <w:r>
               <w:rPr>
-                <w:rFonts w:ascii="Tahoma" w:hAnsi="Tahoma" w:eastAsia="Tahoma"/>
-                <w:color w:val="1F4E79"/>
-                <w:sz w:val="16"/>
+                <w:b w:val="0"/>
+                <w:sz w:val="18"/>
               </w:rPr>
-              <w:t>code</w:t>
-            </w:r>
-            <w:r>
-              <w:rPr>
-                <w:rFonts w:ascii="Tahoma" w:hAnsi="Tahoma" w:eastAsia="Tahoma"/>
-                <w:sz w:val="16"/>
-              </w:rPr>
-              <w:t xml:space="preserve">, </w:t>
-            </w:r>
-            <w:r>
-              <w:rPr>
-                <w:rFonts w:ascii="Tahoma" w:hAnsi="Tahoma" w:eastAsia="Tahoma"/>
-                <w:color w:val="1F4E79"/>
-                <w:sz w:val="16"/>
-              </w:rPr>
-              <w:t>message</w:t>
-            </w:r>
-            <w:r>
-              <w:rPr>
-                <w:rFonts w:ascii="Tahoma" w:hAnsi="Tahoma" w:eastAsia="Tahoma"/>
-                <w:sz w:val="16"/>
-              </w:rPr>
-              <w:t xml:space="preserve">, </w:t>
-            </w:r>
-            <w:r>
-              <w:rPr>
-                <w:rFonts w:ascii="Tahoma" w:hAnsi="Tahoma" w:eastAsia="Tahoma"/>
-                <w:color w:val="1F4E79"/>
-                <w:sz w:val="16"/>
-              </w:rPr>
-              <w:t>fields</w:t>
+              <w:t>code, message, fields</w:t>
             </w:r>
           </w:p>
         </w:tc>
       </w:tr>
     </w:tbl>
-    <w:p>
-      <w:pPr>
-        <w:spacing w:after="20"/>
-      </w:pPr>
-    </w:p>
+    <w:p/>
     <w:p>
       <w:r>
-        <w:t>Request DTO ควรตรวจค่าที่ขอบเขต API ด้วย Pydantic เช่น ชนิดข้อมูล ค่าบังคับ ความยาว และค่าตัวเลือก ส่วนการตรวจว่ารายวิชามีอยู่และการกำหนดผู้เผยแพร่ต้องอาศัยข้อมูลในระบบ จึงเป็นหน้าที่ Service หลัง Router ตรวจตัวตนแล้ว</w:t>
+        <w:t>Pydantic ตรวจชนิดข้อมูล ฟิลด์บังคับ ความยาว และตัวเลือกที่ boundary ส่วน Service ตรวจรายวิชาและกำหนดผู้เผยแพร่จากบัญชีที่ Login แล้ว Request ใช้ strict integer สำหรับ course_id และจำนวนข้อ พร้อม extra=forbid เพื่อปฏิเสธ field ที่ไม่ได้กำหนด</w:t>
       </w:r>
     </w:p>
     <w:p>
@@ -2188,37 +2149,43 @@
     <w:tbl>
       <w:tblPr>
         <w:tblW w:type="auto" w:w="0"/>
-        <w:jc w:val="center"/>
-        <w:tblLayout w:type="fixed"/>
+        <w:tblLayout w:type="autofit"/>
         <w:tblLook w:firstColumn="1" w:firstRow="1" w:lastColumn="0" w:lastRow="0" w:noHBand="0" w:noVBand="1" w:val="04A0"/>
       </w:tblPr>
       <w:tblGrid>
-        <w:gridCol w:w="5083"/>
-        <w:gridCol w:w="5083"/>
+        <w:gridCol w:w="5018"/>
+        <w:gridCol w:w="5018"/>
       </w:tblGrid>
       <w:tr>
+        <w:trPr>
+          <w:cantSplit/>
+          <w:tblHeader/>
+        </w:trPr>
         <w:tc>
           <w:tcPr>
-            <w:tcW w:type="dxa" w:w="1728"/>
-            <w:vAlign w:val="center"/>
-            <w:shd w:fill="1F4E78"/>
+            <w:tcW w:type="dxa" w:w="5018"/>
+            <w:tcBorders>
+              <w:top w:val="single" w:sz="4" w:color="D9D9D9"/>
+              <w:left w:val="single" w:sz="4" w:color="D9D9D9"/>
+              <w:bottom w:val="single" w:sz="4" w:color="D9D9D9"/>
+              <w:right w:val="single" w:sz="4" w:color="D9D9D9"/>
+            </w:tcBorders>
             <w:tcMar>
-              <w:top w:w="75" w:type="dxa"/>
-              <w:start w:w="90" w:type="dxa"/>
-              <w:bottom w:w="75" w:type="dxa"/>
-              <w:end w:w="90" w:type="dxa"/>
+              <w:top w:w="85" w:type="dxa"/>
+              <w:left w:w="85" w:type="dxa"/>
+              <w:bottom w:w="85" w:type="dxa"/>
+              <w:right w:w="85" w:type="dxa"/>
             </w:tcMar>
+            <w:shd w:fill="E8EEF4"/>
           </w:tcPr>
           <w:p>
             <w:pPr>
-              <w:spacing w:after="0"/>
+              <w:spacing w:after="60"/>
             </w:pPr>
             <w:r>
               <w:rPr>
-                <w:rFonts w:ascii="Tahoma" w:hAnsi="Tahoma" w:eastAsia="Tahoma"/>
                 <w:b/>
-                <w:color w:val="FFFFFF"/>
-                <w:sz w:val="16"/>
+                <w:sz w:val="18"/>
               </w:rPr>
               <w:t>ส่วน</w:t>
             </w:r>
@@ -2226,26 +2193,29 @@
         </w:tc>
         <w:tc>
           <w:tcPr>
-            <w:tcW w:type="dxa" w:w="2880"/>
-            <w:vAlign w:val="center"/>
-            <w:shd w:fill="1F4E78"/>
+            <w:tcW w:type="dxa" w:w="5018"/>
+            <w:tcBorders>
+              <w:top w:val="single" w:sz="4" w:color="D9D9D9"/>
+              <w:left w:val="single" w:sz="4" w:color="D9D9D9"/>
+              <w:bottom w:val="single" w:sz="4" w:color="D9D9D9"/>
+              <w:right w:val="single" w:sz="4" w:color="D9D9D9"/>
+            </w:tcBorders>
             <w:tcMar>
-              <w:top w:w="75" w:type="dxa"/>
-              <w:start w:w="90" w:type="dxa"/>
-              <w:bottom w:w="75" w:type="dxa"/>
-              <w:end w:w="90" w:type="dxa"/>
+              <w:top w:w="85" w:type="dxa"/>
+              <w:left w:w="85" w:type="dxa"/>
+              <w:bottom w:w="85" w:type="dxa"/>
+              <w:right w:w="85" w:type="dxa"/>
             </w:tcMar>
+            <w:shd w:fill="E8EEF4"/>
           </w:tcPr>
           <w:p>
             <w:pPr>
-              <w:spacing w:after="0"/>
+              <w:spacing w:after="60"/>
             </w:pPr>
             <w:r>
               <w:rPr>
-                <w:rFonts w:ascii="Tahoma" w:hAnsi="Tahoma" w:eastAsia="Tahoma"/>
                 <w:b/>
-                <w:color w:val="FFFFFF"/>
-                <w:sz w:val="16"/>
+                <w:sz w:val="18"/>
               </w:rPr>
               <w:t>หน้าที่ในเส้นทางเผยแพร่</w:t>
             </w:r>
@@ -2253,27 +2223,33 @@
         </w:tc>
       </w:tr>
       <w:tr>
+        <w:trPr>
+          <w:cantSplit/>
+        </w:trPr>
         <w:tc>
           <w:tcPr>
-            <w:tcW w:type="dxa" w:w="1728"/>
-            <w:vAlign w:val="center"/>
-            <w:shd w:fill="FFFFFF"/>
+            <w:tcW w:type="dxa" w:w="5018"/>
+            <w:tcBorders>
+              <w:top w:val="single" w:sz="4" w:color="D9D9D9"/>
+              <w:left w:val="single" w:sz="4" w:color="D9D9D9"/>
+              <w:bottom w:val="single" w:sz="4" w:color="D9D9D9"/>
+              <w:right w:val="single" w:sz="4" w:color="D9D9D9"/>
+            </w:tcBorders>
             <w:tcMar>
-              <w:top w:w="75" w:type="dxa"/>
-              <w:start w:w="90" w:type="dxa"/>
-              <w:bottom w:w="75" w:type="dxa"/>
-              <w:end w:w="90" w:type="dxa"/>
+              <w:top w:w="85" w:type="dxa"/>
+              <w:left w:w="85" w:type="dxa"/>
+              <w:bottom w:w="85" w:type="dxa"/>
+              <w:right w:w="85" w:type="dxa"/>
             </w:tcMar>
           </w:tcPr>
           <w:p>
             <w:pPr>
-              <w:spacing w:after="0"/>
+              <w:spacing w:after="60"/>
             </w:pPr>
             <w:r>
               <w:rPr>
-                <w:rFonts w:ascii="Tahoma" w:hAnsi="Tahoma" w:eastAsia="Tahoma"/>
-                <w:color w:val="1F4E79"/>
-                <w:sz w:val="16"/>
+                <w:b w:val="0"/>
+                <w:sz w:val="18"/>
               </w:rPr>
               <w:t>backend/app/routers/guides.py</w:t>
             </w:r>
@@ -2281,82 +2257,62 @@
         </w:tc>
         <w:tc>
           <w:tcPr>
-            <w:tcW w:type="dxa" w:w="2880"/>
-            <w:vAlign w:val="center"/>
-            <w:shd w:fill="FFFFFF"/>
+            <w:tcW w:type="dxa" w:w="5018"/>
+            <w:tcBorders>
+              <w:top w:val="single" w:sz="4" w:color="D9D9D9"/>
+              <w:left w:val="single" w:sz="4" w:color="D9D9D9"/>
+              <w:bottom w:val="single" w:sz="4" w:color="D9D9D9"/>
+              <w:right w:val="single" w:sz="4" w:color="D9D9D9"/>
+            </w:tcBorders>
             <w:tcMar>
-              <w:top w:w="75" w:type="dxa"/>
-              <w:start w:w="90" w:type="dxa"/>
-              <w:bottom w:w="75" w:type="dxa"/>
-              <w:end w:w="90" w:type="dxa"/>
+              <w:top w:w="85" w:type="dxa"/>
+              <w:left w:w="85" w:type="dxa"/>
+              <w:bottom w:w="85" w:type="dxa"/>
+              <w:right w:w="85" w:type="dxa"/>
             </w:tcMar>
           </w:tcPr>
           <w:p>
             <w:pPr>
-              <w:spacing w:after="0"/>
+              <w:spacing w:after="60"/>
             </w:pPr>
             <w:r>
               <w:rPr>
-                <w:rFonts w:ascii="Tahoma" w:hAnsi="Tahoma" w:eastAsia="Tahoma"/>
-                <w:sz w:val="16"/>
+                <w:b w:val="0"/>
+                <w:sz w:val="18"/>
               </w:rPr>
-              <w:t xml:space="preserve">ประกาศ </w:t>
-            </w:r>
-            <w:r>
-              <w:rPr>
-                <w:rFonts w:ascii="Tahoma" w:hAnsi="Tahoma" w:eastAsia="Tahoma"/>
-                <w:color w:val="1F4E79"/>
-                <w:sz w:val="16"/>
-              </w:rPr>
-              <w:t>POST /guides</w:t>
-            </w:r>
-            <w:r>
-              <w:rPr>
-                <w:rFonts w:ascii="Tahoma" w:hAnsi="Tahoma" w:eastAsia="Tahoma"/>
-                <w:sz w:val="16"/>
-              </w:rPr>
-              <w:t xml:space="preserve">, รับ Request DTO, ใช้ </w:t>
-            </w:r>
-            <w:r>
-              <w:rPr>
-                <w:rFonts w:ascii="Tahoma" w:hAnsi="Tahoma" w:eastAsia="Tahoma"/>
-                <w:color w:val="1F4E79"/>
-                <w:sz w:val="16"/>
-              </w:rPr>
-              <w:t>current_user</w:t>
-            </w:r>
-            <w:r>
-              <w:rPr>
-                <w:rFonts w:ascii="Tahoma" w:hAnsi="Tahoma" w:eastAsia="Tahoma"/>
-                <w:sz w:val="16"/>
-              </w:rPr>
-              <w:t xml:space="preserve"> และเรียก Service</w:t>
+              <w:t>ประกาศ POST /guides, รับ Request DTO, ใช้ current_user และเรียก Service</w:t>
             </w:r>
           </w:p>
         </w:tc>
       </w:tr>
       <w:tr>
+        <w:trPr>
+          <w:cantSplit/>
+        </w:trPr>
         <w:tc>
           <w:tcPr>
-            <w:tcW w:type="dxa" w:w="1728"/>
-            <w:vAlign w:val="center"/>
-            <w:shd w:fill="F3F6FA"/>
+            <w:tcW w:type="dxa" w:w="5018"/>
+            <w:tcBorders>
+              <w:top w:val="single" w:sz="4" w:color="D9D9D9"/>
+              <w:left w:val="single" w:sz="4" w:color="D9D9D9"/>
+              <w:bottom w:val="single" w:sz="4" w:color="D9D9D9"/>
+              <w:right w:val="single" w:sz="4" w:color="D9D9D9"/>
+            </w:tcBorders>
             <w:tcMar>
-              <w:top w:w="75" w:type="dxa"/>
-              <w:start w:w="90" w:type="dxa"/>
-              <w:bottom w:w="75" w:type="dxa"/>
-              <w:end w:w="90" w:type="dxa"/>
+              <w:top w:w="85" w:type="dxa"/>
+              <w:left w:w="85" w:type="dxa"/>
+              <w:bottom w:w="85" w:type="dxa"/>
+              <w:right w:w="85" w:type="dxa"/>
             </w:tcMar>
           </w:tcPr>
           <w:p>
             <w:pPr>
-              <w:spacing w:after="0"/>
+              <w:spacing w:after="60"/>
             </w:pPr>
             <w:r>
               <w:rPr>
-                <w:rFonts w:ascii="Tahoma" w:hAnsi="Tahoma" w:eastAsia="Tahoma"/>
-                <w:color w:val="1F4E79"/>
-                <w:sz w:val="16"/>
+                <w:b w:val="0"/>
+                <w:sz w:val="18"/>
               </w:rPr>
               <w:t>backend/app/schemas/guides.py</w:t>
             </w:r>
@@ -2364,24 +2320,28 @@
         </w:tc>
         <w:tc>
           <w:tcPr>
-            <w:tcW w:type="dxa" w:w="2880"/>
-            <w:vAlign w:val="center"/>
-            <w:shd w:fill="F3F6FA"/>
+            <w:tcW w:type="dxa" w:w="5018"/>
+            <w:tcBorders>
+              <w:top w:val="single" w:sz="4" w:color="D9D9D9"/>
+              <w:left w:val="single" w:sz="4" w:color="D9D9D9"/>
+              <w:bottom w:val="single" w:sz="4" w:color="D9D9D9"/>
+              <w:right w:val="single" w:sz="4" w:color="D9D9D9"/>
+            </w:tcBorders>
             <w:tcMar>
-              <w:top w:w="75" w:type="dxa"/>
-              <w:start w:w="90" w:type="dxa"/>
-              <w:bottom w:w="75" w:type="dxa"/>
-              <w:end w:w="90" w:type="dxa"/>
+              <w:top w:w="85" w:type="dxa"/>
+              <w:left w:w="85" w:type="dxa"/>
+              <w:bottom w:w="85" w:type="dxa"/>
+              <w:right w:w="85" w:type="dxa"/>
             </w:tcMar>
           </w:tcPr>
           <w:p>
             <w:pPr>
-              <w:spacing w:after="0"/>
+              <w:spacing w:after="60"/>
             </w:pPr>
             <w:r>
               <w:rPr>
-                <w:rFonts w:ascii="Tahoma" w:hAnsi="Tahoma" w:eastAsia="Tahoma"/>
-                <w:sz w:val="16"/>
+                <w:b w:val="0"/>
+                <w:sz w:val="18"/>
               </w:rPr>
               <w:t>ประกาศ Request, Response และ Error DTO ด้วย Pydantic</w:t>
             </w:r>
@@ -2389,27 +2349,33 @@
         </w:tc>
       </w:tr>
       <w:tr>
+        <w:trPr>
+          <w:cantSplit/>
+        </w:trPr>
         <w:tc>
           <w:tcPr>
-            <w:tcW w:type="dxa" w:w="1728"/>
-            <w:vAlign w:val="center"/>
-            <w:shd w:fill="FFFFFF"/>
+            <w:tcW w:type="dxa" w:w="5018"/>
+            <w:tcBorders>
+              <w:top w:val="single" w:sz="4" w:color="D9D9D9"/>
+              <w:left w:val="single" w:sz="4" w:color="D9D9D9"/>
+              <w:bottom w:val="single" w:sz="4" w:color="D9D9D9"/>
+              <w:right w:val="single" w:sz="4" w:color="D9D9D9"/>
+            </w:tcBorders>
             <w:tcMar>
-              <w:top w:w="75" w:type="dxa"/>
-              <w:start w:w="90" w:type="dxa"/>
-              <w:bottom w:w="75" w:type="dxa"/>
-              <w:end w:w="90" w:type="dxa"/>
+              <w:top w:w="85" w:type="dxa"/>
+              <w:left w:w="85" w:type="dxa"/>
+              <w:bottom w:w="85" w:type="dxa"/>
+              <w:right w:w="85" w:type="dxa"/>
             </w:tcMar>
           </w:tcPr>
           <w:p>
             <w:pPr>
-              <w:spacing w:after="0"/>
+              <w:spacing w:after="60"/>
             </w:pPr>
             <w:r>
               <w:rPr>
-                <w:rFonts w:ascii="Tahoma" w:hAnsi="Tahoma" w:eastAsia="Tahoma"/>
-                <w:color w:val="1F4E79"/>
-                <w:sz w:val="16"/>
+                <w:b w:val="0"/>
+                <w:sz w:val="18"/>
               </w:rPr>
               <w:t>backend/app/services/publish_guide.py</w:t>
             </w:r>
@@ -2417,24 +2383,28 @@
         </w:tc>
         <w:tc>
           <w:tcPr>
-            <w:tcW w:type="dxa" w:w="2880"/>
-            <w:vAlign w:val="center"/>
-            <w:shd w:fill="FFFFFF"/>
+            <w:tcW w:type="dxa" w:w="5018"/>
+            <w:tcBorders>
+              <w:top w:val="single" w:sz="4" w:color="D9D9D9"/>
+              <w:left w:val="single" w:sz="4" w:color="D9D9D9"/>
+              <w:bottom w:val="single" w:sz="4" w:color="D9D9D9"/>
+              <w:right w:val="single" w:sz="4" w:color="D9D9D9"/>
+            </w:tcBorders>
             <w:tcMar>
-              <w:top w:w="75" w:type="dxa"/>
-              <w:start w:w="90" w:type="dxa"/>
-              <w:bottom w:w="75" w:type="dxa"/>
-              <w:end w:w="90" w:type="dxa"/>
+              <w:top w:w="85" w:type="dxa"/>
+              <w:left w:w="85" w:type="dxa"/>
+              <w:bottom w:w="85" w:type="dxa"/>
+              <w:right w:w="85" w:type="dxa"/>
             </w:tcMar>
           </w:tcPr>
           <w:p>
             <w:pPr>
-              <w:spacing w:after="0"/>
+              <w:spacing w:after="60"/>
             </w:pPr>
             <w:r>
               <w:rPr>
-                <w:rFonts w:ascii="Tahoma" w:hAnsi="Tahoma" w:eastAsia="Tahoma"/>
-                <w:sz w:val="16"/>
+                <w:b w:val="0"/>
+                <w:sz w:val="18"/>
               </w:rPr>
               <w:t>ตรวจเงื่อนไขที่ต้องอ่านข้อมูลระบบ กำหนดเจ้าของจากผู้ใช้ปัจจุบัน และประสานการสร้างรายการ</w:t>
             </w:r>
@@ -2442,27 +2412,33 @@
         </w:tc>
       </w:tr>
       <w:tr>
+        <w:trPr>
+          <w:cantSplit/>
+        </w:trPr>
         <w:tc>
           <w:tcPr>
-            <w:tcW w:type="dxa" w:w="1728"/>
-            <w:vAlign w:val="center"/>
-            <w:shd w:fill="F3F6FA"/>
+            <w:tcW w:type="dxa" w:w="5018"/>
+            <w:tcBorders>
+              <w:top w:val="single" w:sz="4" w:color="D9D9D9"/>
+              <w:left w:val="single" w:sz="4" w:color="D9D9D9"/>
+              <w:bottom w:val="single" w:sz="4" w:color="D9D9D9"/>
+              <w:right w:val="single" w:sz="4" w:color="D9D9D9"/>
+            </w:tcBorders>
             <w:tcMar>
-              <w:top w:w="75" w:type="dxa"/>
-              <w:start w:w="90" w:type="dxa"/>
-              <w:bottom w:w="75" w:type="dxa"/>
-              <w:end w:w="90" w:type="dxa"/>
+              <w:top w:w="85" w:type="dxa"/>
+              <w:left w:w="85" w:type="dxa"/>
+              <w:bottom w:w="85" w:type="dxa"/>
+              <w:right w:w="85" w:type="dxa"/>
             </w:tcMar>
           </w:tcPr>
           <w:p>
             <w:pPr>
-              <w:spacing w:after="0"/>
+              <w:spacing w:after="60"/>
             </w:pPr>
             <w:r>
               <w:rPr>
-                <w:rFonts w:ascii="Tahoma" w:hAnsi="Tahoma" w:eastAsia="Tahoma"/>
-                <w:color w:val="1F4E79"/>
-                <w:sz w:val="16"/>
+                <w:b w:val="0"/>
+                <w:sz w:val="18"/>
               </w:rPr>
               <w:t>backend/app/dao/publish_guide_dao.py</w:t>
             </w:r>
@@ -2470,24 +2446,28 @@
         </w:tc>
         <w:tc>
           <w:tcPr>
-            <w:tcW w:type="dxa" w:w="2880"/>
-            <w:vAlign w:val="center"/>
-            <w:shd w:fill="F3F6FA"/>
+            <w:tcW w:type="dxa" w:w="5018"/>
+            <w:tcBorders>
+              <w:top w:val="single" w:sz="4" w:color="D9D9D9"/>
+              <w:left w:val="single" w:sz="4" w:color="D9D9D9"/>
+              <w:bottom w:val="single" w:sz="4" w:color="D9D9D9"/>
+              <w:right w:val="single" w:sz="4" w:color="D9D9D9"/>
+            </w:tcBorders>
             <w:tcMar>
-              <w:top w:w="75" w:type="dxa"/>
-              <w:start w:w="90" w:type="dxa"/>
-              <w:bottom w:w="75" w:type="dxa"/>
-              <w:end w:w="90" w:type="dxa"/>
+              <w:top w:w="85" w:type="dxa"/>
+              <w:left w:w="85" w:type="dxa"/>
+              <w:bottom w:w="85" w:type="dxa"/>
+              <w:right w:w="85" w:type="dxa"/>
             </w:tcMar>
           </w:tcPr>
           <w:p>
             <w:pPr>
-              <w:spacing w:after="0"/>
+              <w:spacing w:after="60"/>
             </w:pPr>
             <w:r>
               <w:rPr>
-                <w:rFonts w:ascii="Tahoma" w:hAnsi="Tahoma" w:eastAsia="Tahoma"/>
-                <w:sz w:val="16"/>
+                <w:b w:val="0"/>
+                <w:sz w:val="18"/>
               </w:rPr>
               <w:t>บันทึก Entity ผ่าน SQLAlchemy session ตามรูปแบบที่ทีมเลือกใน Task56</w:t>
             </w:r>
@@ -2495,27 +2475,33 @@
         </w:tc>
       </w:tr>
       <w:tr>
+        <w:trPr>
+          <w:cantSplit/>
+        </w:trPr>
         <w:tc>
           <w:tcPr>
-            <w:tcW w:type="dxa" w:w="1728"/>
-            <w:vAlign w:val="center"/>
-            <w:shd w:fill="FFFFFF"/>
+            <w:tcW w:type="dxa" w:w="5018"/>
+            <w:tcBorders>
+              <w:top w:val="single" w:sz="4" w:color="D9D9D9"/>
+              <w:left w:val="single" w:sz="4" w:color="D9D9D9"/>
+              <w:bottom w:val="single" w:sz="4" w:color="D9D9D9"/>
+              <w:right w:val="single" w:sz="4" w:color="D9D9D9"/>
+            </w:tcBorders>
             <w:tcMar>
-              <w:top w:w="75" w:type="dxa"/>
-              <w:start w:w="90" w:type="dxa"/>
-              <w:bottom w:w="75" w:type="dxa"/>
-              <w:end w:w="90" w:type="dxa"/>
+              <w:top w:w="85" w:type="dxa"/>
+              <w:left w:w="85" w:type="dxa"/>
+              <w:bottom w:w="85" w:type="dxa"/>
+              <w:right w:w="85" w:type="dxa"/>
             </w:tcMar>
           </w:tcPr>
           <w:p>
             <w:pPr>
-              <w:spacing w:after="0"/>
+              <w:spacing w:after="60"/>
             </w:pPr>
             <w:r>
               <w:rPr>
-                <w:rFonts w:ascii="Tahoma" w:hAnsi="Tahoma" w:eastAsia="Tahoma"/>
-                <w:color w:val="1F4E79"/>
-                <w:sz w:val="16"/>
+                <w:b w:val="0"/>
+                <w:sz w:val="18"/>
               </w:rPr>
               <w:t>backend/app/models/guide.py</w:t>
             </w:r>
@@ -2523,76 +2509,39 @@
         </w:tc>
         <w:tc>
           <w:tcPr>
-            <w:tcW w:type="dxa" w:w="2880"/>
-            <w:vAlign w:val="center"/>
-            <w:shd w:fill="FFFFFF"/>
+            <w:tcW w:type="dxa" w:w="5018"/>
+            <w:tcBorders>
+              <w:top w:val="single" w:sz="4" w:color="D9D9D9"/>
+              <w:left w:val="single" w:sz="4" w:color="D9D9D9"/>
+              <w:bottom w:val="single" w:sz="4" w:color="D9D9D9"/>
+              <w:right w:val="single" w:sz="4" w:color="D9D9D9"/>
+            </w:tcBorders>
             <w:tcMar>
-              <w:top w:w="75" w:type="dxa"/>
-              <w:start w:w="90" w:type="dxa"/>
-              <w:bottom w:w="75" w:type="dxa"/>
-              <w:end w:w="90" w:type="dxa"/>
+              <w:top w:w="85" w:type="dxa"/>
+              <w:left w:w="85" w:type="dxa"/>
+              <w:bottom w:w="85" w:type="dxa"/>
+              <w:right w:w="85" w:type="dxa"/>
             </w:tcMar>
           </w:tcPr>
           <w:p>
             <w:pPr>
-              <w:spacing w:after="0"/>
+              <w:spacing w:after="60"/>
             </w:pPr>
             <w:r>
               <w:rPr>
-                <w:rFonts w:ascii="Tahoma" w:hAnsi="Tahoma" w:eastAsia="Tahoma"/>
-                <w:sz w:val="16"/>
+                <w:b w:val="0"/>
+                <w:sz w:val="18"/>
               </w:rPr>
-              <w:t xml:space="preserve">ใช้ Entity </w:t>
-            </w:r>
-            <w:r>
-              <w:rPr>
-                <w:rFonts w:ascii="Tahoma" w:hAnsi="Tahoma" w:eastAsia="Tahoma"/>
-                <w:color w:val="1F4E79"/>
-                <w:sz w:val="16"/>
-              </w:rPr>
-              <w:t>Guide</w:t>
-            </w:r>
-            <w:r>
-              <w:rPr>
-                <w:rFonts w:ascii="Tahoma" w:hAnsi="Tahoma" w:eastAsia="Tahoma"/>
-                <w:sz w:val="16"/>
-              </w:rPr>
-              <w:t xml:space="preserve"> เดิม หากกติกาฟอร์มกับโครงสร้างข้อมูลไม่ขัดกัน</w:t>
+              <w:t>Guide Entity ที่ใช้ร่วมกับการอ่าน แก้ไข และลบ</w:t>
             </w:r>
           </w:p>
         </w:tc>
       </w:tr>
     </w:tbl>
-    <w:p>
-      <w:pPr>
-        <w:spacing w:after="20"/>
-      </w:pPr>
-    </w:p>
+    <w:p/>
     <w:p>
       <w:r>
-        <w:t xml:space="preserve">Service และ DAO ควรเป็นคลาสเมื่อมี dependency และหน้าที่ต่อเนื่องตามรูปแบบเดิมของ </w:t>
-      </w:r>
-      <w:r>
-        <w:rPr>
-          <w:rFonts w:ascii="Consolas" w:hAnsi="Consolas"/>
-          <w:color w:val="1F4E79"/>
-          <w:sz w:val="17"/>
-        </w:rPr>
-        <w:t>ReadGuideService</w:t>
-      </w:r>
-      <w:r>
-        <w:t xml:space="preserve"> และ </w:t>
-      </w:r>
-      <w:r>
-        <w:rPr>
-          <w:rFonts w:ascii="Consolas" w:hAnsi="Consolas"/>
-          <w:color w:val="1F4E79"/>
-          <w:sz w:val="17"/>
-        </w:rPr>
-        <w:t>ReadGuideDAO</w:t>
-      </w:r>
-      <w:r>
-        <w:t xml:space="preserve"> ไม่เพิ่มคลาสแยกสำหรับการแปลงค่าที่มีผู้เรียกเพียงจุดเดียว</w:t>
+        <w:t>Service รับ Session และ DAO จาก dependencies.py ส่วน DAO ทำ add/flush โดยไม่ commit เอง</w:t>
       </w:r>
     </w:p>
     <w:p>
@@ -2605,12 +2554,17 @@
     </w:p>
     <w:p>
       <w:pPr>
-        <w:jc w:val="center"/>
+        <w:pStyle w:val="Heading2"/>
       </w:pPr>
+      <w:r>
+        <w:t>แผนภาพ 1</w:t>
+      </w:r>
+    </w:p>
+    <w:p>
       <w:r>
         <w:drawing>
           <wp:inline xmlns:a="http://schemas.openxmlformats.org/drawingml/2006/main" xmlns:pic="http://schemas.openxmlformats.org/drawingml/2006/picture">
-            <wp:extent cx="6080760" cy="3161995"/>
+            <wp:extent cx="6309360" cy="2198100"/>
             <wp:docPr id="1" name="Picture 1"/>
             <wp:cNvGraphicFramePr>
               <a:graphicFrameLocks noChangeAspect="1"/>
@@ -2619,7 +2573,7 @@
               <a:graphicData uri="http://schemas.openxmlformats.org/drawingml/2006/picture">
                 <pic:pic>
                   <pic:nvPicPr>
-                    <pic:cNvPr id="0" name="_task52_flow.png"/>
+                    <pic:cNvPr id="0" name="rendered-diagrams-12.png"/>
                     <pic:cNvPicPr/>
                   </pic:nvPicPr>
                   <pic:blipFill>
@@ -2631,7 +2585,7 @@
                   <pic:spPr>
                     <a:xfrm>
                       <a:off x="0" y="0"/>
-                      <a:ext cx="6080760" cy="3161995"/>
+                      <a:ext cx="6309360" cy="2198100"/>
                     </a:xfrm>
                     <a:prstGeom prst="rect"/>
                   </pic:spPr>
@@ -2643,53 +2597,8 @@
       </w:r>
     </w:p>
     <w:p>
-      <w:pPr>
-        <w:jc w:val="center"/>
-      </w:pPr>
       <w:r>
-        <w:rPr>
-          <w:i/>
-          <w:sz w:val="16"/>
-        </w:rPr>
-        <w:t>ภาพ 1 แผนภาพองค์ประกอบของ API เผยแพร่แนวข้อสอบ</w:t>
-      </w:r>
-    </w:p>
-    <w:p>
-      <w:pPr>
-        <w:spacing w:after="120"/>
-        <w:ind w:left="173"/>
-        <w:shd w:fill="F3F5F7"/>
-      </w:pPr>
-      <w:r>
-        <w:rPr>
-          <w:rFonts w:ascii="Consolas" w:hAnsi="Consolas"/>
-          <w:color w:val="2D3748"/>
-          <w:sz w:val="16"/>
-        </w:rPr>
-        <w:t>flowchart LR</w:t>
-        <w:br/>
-        <w:t xml:space="preserve">    Client[หน้าเว็บ] --&gt; Router[Guide Router]</w:t>
-        <w:br/>
-        <w:t xml:space="preserve">    Router --&gt; Auth[current_user]</w:t>
-        <w:br/>
-        <w:t xml:space="preserve">    Router --&gt; RequestDTO[GuidePublishRequestDTO]</w:t>
-        <w:br/>
-        <w:t xml:space="preserve">    Router --&gt; Service[PublishGuideService]</w:t>
-        <w:br/>
-        <w:t xml:space="preserve">    Service --&gt; CourseDAO[CourseDAO ตรวจรายวิชา]</w:t>
-        <w:br/>
-        <w:t xml:space="preserve">    Service --&gt; PublishDAO[PublishGuideDAO]</w:t>
-        <w:br/>
-        <w:t xml:space="preserve">    PublishDAO --&gt; Guide[(Guide Entity)]</w:t>
-        <w:br/>
-        <w:t xml:space="preserve">    Service --&gt; ResponseDTO[GuideDetailResponseDTO]</w:t>
-        <w:br/>
-        <w:t xml:space="preserve">    Router --&gt; ErrorDTO[ErrorResponseDTO]</w:t>
-      </w:r>
-    </w:p>
-    <w:p>
-      <w:r>
-        <w:t>แผนภาพนี้แสดงเฉพาะส่วนที่รับผิดชอบ API และ DTO ลำดับการเรียกเมธอดระหว่าง UI, API, DAO และฐานข้อมูลเป็นงาน Task53</w:t>
+        <w:t>แผนภาพนี้แสดงส่วนประกอบ API และ DTO ไม่ใช่ Sequence ดูลำดับ Browser, Node proxy, API, Service, DAO และ transaction ใน Task53</w:t>
       </w:r>
     </w:p>
     <w:p>
@@ -2697,31 +2606,22 @@
         <w:pStyle w:val="Heading1"/>
       </w:pPr>
       <w:r>
-        <w:t>จุดที่ต้องยืนยันก่อน Task57</w:t>
+        <w:t>สถานะที่ implement แล้ว</w:t>
       </w:r>
     </w:p>
     <w:p>
-      <w:pPr>
-        <w:pStyle w:val="ListNumber"/>
-      </w:pPr>
       <w:r>
-        <w:t>Task50 ให้เลือกปีจากชุดค่าที่ระบบเตรียมไว้ แต่ยังไม่พบแหล่งค่าที่อนุญาตใน Backend ต้องระบุชุดข้อมูลหรือกติกาสร้างชุดปี</w:t>
+        <w:t>1. Request schema ใช้ AcademicYear ร่วมกันสำหรับปี 2566–2569</w:t>
       </w:r>
     </w:p>
     <w:p>
-      <w:pPr>
-        <w:pStyle w:val="ListNumber"/>
-      </w:pPr>
       <w:r>
-        <w:rPr>
-          <w:rFonts w:ascii="Consolas" w:hAnsi="Consolas"/>
-          <w:color w:val="1F4E79"/>
-          <w:sz w:val="17"/>
-        </w:rPr>
-        <w:t>POST /guides</w:t>
+        <w:t>2. Backend ลงทะเบียน POST /guides แล้ว ส่วน Browser เรียก POST /api/guides ผ่าน Node proxy</w:t>
       </w:r>
+    </w:p>
+    <w:p>
       <w:r>
-        <w:t xml:space="preserve"> เป็นเส้นทางที่เสนอให้เข้ากับ API อ่านเดิม ทีมควรยืนยันก่อนเริ่ม Task57</w:t>
+        <w:t>3. PublishGuideService เตรียม response ก่อน commit และเป็นผู้คุม transaction ของ User กับ Guide ร่วมกัน DAO ไม่ commit เอง</w:t>
       </w:r>
     </w:p>
     <w:p>
@@ -2733,56 +2633,43 @@
       </w:r>
     </w:p>
     <w:p>
-      <w:pPr>
-        <w:pStyle w:val="ListBullet"/>
-      </w:pPr>
       <w:r>
-        <w:t>มีวิธีเรียก API, Request/Response ตัวอย่าง และรายการข้อผิดพลาด</w:t>
+        <w:t>- มีวิธีเรียก API, Request/Response ตัวอย่าง และรายการข้อผิดพลาด</w:t>
       </w:r>
     </w:p>
     <w:p>
-      <w:pPr>
-        <w:pStyle w:val="ListBullet"/>
-      </w:pPr>
       <w:r>
-        <w:t>Request ไม่เปิดให้กำหนดผู้เผยแพร่หรือชื่อผู้สอน</w:t>
+        <w:t>- Request ไม่เปิดให้กำหนดผู้เผยแพร่หรือชื่อผู้สอน</w:t>
       </w:r>
     </w:p>
     <w:p>
-      <w:pPr>
-        <w:pStyle w:val="ListBullet"/>
-      </w:pPr>
       <w:r>
-        <w:t>ระบุชัดว่า DTO ตรวจข้อมูลรูปแบบใด และ Service ตรวจข้อมูลที่ต้องอ่านจากระบบ</w:t>
+        <w:t>- ระบุชัดว่า DTO ตรวจข้อมูลรูปแบบใด และ Service ตรวจข้อมูลที่ต้องอ่านจากระบบ</w:t>
       </w:r>
     </w:p>
     <w:p>
-      <w:pPr>
-        <w:pStyle w:val="ListBullet"/>
-      </w:pPr>
       <w:r>
-        <w:t>แผนภาพแสดง Router, Auth, DTO และ Service โดยไม่ลงรายละเอียด Sequence ของ Task53</w:t>
+        <w:t>- แผนภาพแสดง Router, Auth, DTO และ Service โดยไม่ลงรายละเอียด Sequence ของ Task53</w:t>
       </w:r>
     </w:p>
     <w:p>
-      <w:pPr>
-        <w:pStyle w:val="ListBullet"/>
-      </w:pPr>
       <w:r>
-        <w:t>รูปแบบข้อสอบ จำนวนข้อ และผู้สอนตรงกับ Dropdown และ Entity ที่มีอยู่</w:t>
+        <w:t>- รูปแบบข้อสอบ จำนวนข้อ และผู้สอนตรงกับ Dropdown และ Entity ที่มีอยู่</w:t>
       </w:r>
     </w:p>
     <w:p>
-      <w:pPr>
-        <w:pStyle w:val="ListBullet"/>
-      </w:pPr>
       <w:r>
-        <w:t>จุดที่ยังต้องยืนยันก่อนเริ่มพัฒนา API ถูกระบุไว้</w:t>
+        <w:t>- แยก contract ของ backend ออกจาก Node proxy และระบุข้อจำกัดของผลที่ยืนยันไม่ได้</w:t>
+      </w:r>
+    </w:p>
+    <w:p>
+      <w:r>
+        <w:t>หาก network timeout หลังส่งฟอร์ม ไม่สามารถสรุปว่าฐานข้อมูล rollback แล้ว หน้าเว็บแจ้งให้ตรวจรายการก่อนส่งซ้ำ ส่วนปีที่อนุญาตและรูปแบบข้อสอบใช้ตาม schema ไม่สร้างตัวเลือกใหม่จาก request</w:t>
       </w:r>
     </w:p>
     <w:sectPr>
-      <w:pgSz w:w="12240" w:h="15840"/>
-      <w:pgMar w:top="936" w:right="1037" w:bottom="936" w:left="1037" w:header="720" w:footer="720" w:gutter="0"/>
+      <w:pgSz w:w="11909" w:h="16834"/>
+      <w:pgMar w:top="936" w:right="936" w:bottom="936" w:left="936" w:header="720" w:footer="720" w:gutter="0"/>
       <w:cols w:space="720"/>
       <w:docGrid w:linePitch="360"/>
     </w:sectPr>
@@ -3154,12 +3041,12 @@
     <w:qFormat/>
     <w:rsid w:val="00FC693F"/>
     <w:pPr>
-      <w:spacing w:after="100" w:line="259" w:lineRule="auto"/>
+      <w:spacing w:after="100" w:line="269" w:lineRule="auto"/>
     </w:pPr>
     <w:rPr>
-      <w:rFonts w:ascii="Tahoma" w:hAnsi="Tahoma" w:eastAsia="Tahoma"/>
+      <w:rFonts w:ascii="Tahoma" w:hAnsi="Tahoma" w:eastAsia="Tahoma" w:cs="Tahoma"/>
       <w:color w:val="000000"/>
-      <w:sz w:val="19"/>
+      <w:sz w:val="22"/>
     </w:rPr>
   </w:style>
   <w:style w:type="paragraph" w:styleId="Header">
@@ -3221,11 +3108,11 @@
       <w:outlineLvl w:val="0"/>
     </w:pPr>
     <w:rPr>
-      <w:rFonts w:asciiTheme="majorHAnsi" w:eastAsiaTheme="majorEastAsia" w:hAnsiTheme="majorHAnsi" w:cstheme="majorBidi" w:ascii="Tahoma" w:hAnsi="Tahoma" w:eastAsia="Tahoma"/>
+      <w:rFonts w:asciiTheme="majorHAnsi" w:eastAsiaTheme="majorEastAsia" w:hAnsiTheme="majorHAnsi" w:cstheme="majorBidi" w:ascii="Tahoma" w:hAnsi="Tahoma" w:eastAsia="Tahoma" w:cs="Tahoma"/>
       <w:b/>
       <w:bCs/>
       <w:color w:val="000000"/>
-      <w:sz w:val="32"/>
+      <w:sz w:val="30"/>
       <w:szCs w:val="28"/>
     </w:rPr>
   </w:style>
@@ -3245,11 +3132,11 @@
       <w:outlineLvl w:val="1"/>
     </w:pPr>
     <w:rPr>
-      <w:rFonts w:asciiTheme="majorHAnsi" w:eastAsiaTheme="majorEastAsia" w:hAnsiTheme="majorHAnsi" w:cstheme="majorBidi" w:ascii="Tahoma" w:hAnsi="Tahoma" w:eastAsia="Tahoma"/>
+      <w:rFonts w:asciiTheme="majorHAnsi" w:eastAsiaTheme="majorEastAsia" w:hAnsiTheme="majorHAnsi" w:cstheme="majorBidi" w:ascii="Tahoma" w:hAnsi="Tahoma" w:eastAsia="Tahoma" w:cs="Tahoma"/>
       <w:b/>
       <w:bCs/>
       <w:color w:val="000000"/>
-      <w:sz w:val="24"/>
+      <w:sz w:val="26"/>
       <w:szCs w:val="26"/>
     </w:rPr>
   </w:style>
@@ -3269,11 +3156,11 @@
       <w:outlineLvl w:val="2"/>
     </w:pPr>
     <w:rPr>
-      <w:rFonts w:asciiTheme="majorHAnsi" w:eastAsiaTheme="majorEastAsia" w:hAnsiTheme="majorHAnsi" w:cstheme="majorBidi" w:ascii="Tahoma" w:hAnsi="Tahoma" w:eastAsia="Tahoma"/>
+      <w:rFonts w:asciiTheme="majorHAnsi" w:eastAsiaTheme="majorEastAsia" w:hAnsiTheme="majorHAnsi" w:cstheme="majorBidi" w:ascii="Tahoma" w:hAnsi="Tahoma" w:eastAsia="Tahoma" w:cs="Tahoma"/>
       <w:b/>
       <w:bCs/>
       <w:color w:val="000000"/>
-      <w:sz w:val="21"/>
+      <w:sz w:val="22"/>
     </w:rPr>
   </w:style>
   <w:style w:type="paragraph" w:styleId="Heading4">
@@ -3504,18 +3391,15 @@
     <w:qFormat/>
     <w:rsid w:val="00FC693F"/>
     <w:pPr>
-      <w:pBdr>
-        <w:bottom w:val="single" w:sz="8" w:space="4" w:color="4F81BD" w:themeColor="accent1"/>
-      </w:pBdr>
       <w:spacing w:after="300" w:line="240" w:lineRule="auto"/>
       <w:contextualSpacing/>
     </w:pPr>
     <w:rPr>
-      <w:rFonts w:asciiTheme="majorHAnsi" w:eastAsiaTheme="majorEastAsia" w:hAnsiTheme="majorHAnsi" w:cstheme="majorBidi" w:ascii="Tahoma" w:hAnsi="Tahoma" w:eastAsia="Tahoma"/>
+      <w:rFonts w:asciiTheme="majorHAnsi" w:eastAsiaTheme="majorEastAsia" w:hAnsiTheme="majorHAnsi" w:cstheme="majorBidi" w:ascii="Tahoma" w:hAnsi="Tahoma" w:eastAsia="Tahoma" w:cs="Tahoma"/>
       <w:color w:val="000000"/>
       <w:spacing w:val="5"/>
       <w:kern w:val="28"/>
-      <w:sz w:val="44"/>
+      <w:sz w:val="38"/>
       <w:szCs w:val="52"/>
     </w:rPr>
   </w:style>
@@ -3991,9 +3875,6 @@
     <w:qFormat/>
     <w:rsid w:val="00FC693F"/>
     <w:pPr>
-      <w:pBdr>
-        <w:bottom w:val="single" w:sz="4" w:space="4" w:color="4F81BD" w:themeColor="accent1"/>
-      </w:pBdr>
       <w:spacing w:before="200" w:after="280"/>
       <w:ind w:left="936" w:right="936"/>
     </w:pPr>

</xml_diff>